<commit_message>
Phase 3: WinForms MDI interface (menu, toolbar, status bar, calc/graph/help/about windows)
Core now multi-targets netstandard2.0 and net48; added NumberParser and AxisScale.
KT materials updated to match the implemented interface.

Co-Authored-By: Claude Sonnet 5.5 <noreply@anthropic.com>
Claude-Session: https://claude.ai/code/session_01GVqkJddKe6CucL3vgR8vdk
</commit_message>
<xml_diff>
--- a/docs/kt/KT_materialy_2026-10-19.docx
+++ b/docs/kt/KT_materialy_2026-10-19.docx
@@ -9905,6 +9905,554 @@
                 <w:sz w:val="17"/>
                 <w:szCs w:val="17"/>
               </w:rPr>
+              <w:t xml:space="preserve">Ui.ControlHeight</w:t>
+            </w:r>
+          </w:p>
+        </w:tc>
+        <w:tc>
+          <w:tcPr>
+            <w:tcW w:type="dxa" w:w="1650"/>
+            <w:tcBorders>
+              <w:top w:val="single" w:color="000000" w:sz="4"/>
+              <w:left w:val="single" w:color="000000" w:sz="4"/>
+              <w:bottom w:val="single" w:color="000000" w:sz="4"/>
+              <w:right w:val="single" w:color="000000" w:sz="4"/>
+            </w:tcBorders>
+            <w:tcMar>
+              <w:top w:type="dxa" w:w="20"/>
+              <w:left w:type="dxa" w:w="80"/>
+              <w:bottom w:type="dxa" w:w="20"/>
+              <w:right w:type="dxa" w:w="80"/>
+            </w:tcMar>
+            <w:vAlign w:val="center"/>
+          </w:tcPr>
+          <w:p>
+            <w:pPr>
+              <w:spacing w:line="240"/>
+              <w:ind w:firstLine="0"/>
+              <w:jc w:val="left"/>
+            </w:pPr>
+            <w:r>
+              <w:rPr>
+                <w:rFonts w:ascii="Times New Roman" w:cs="Times New Roman" w:eastAsia="Times New Roman" w:hAnsi="Times New Roman"/>
+                <w:sz w:val="22"/>
+                <w:szCs w:val="22"/>
+              </w:rPr>
+              <w:t xml:space="preserve">20</w:t>
+            </w:r>
+          </w:p>
+        </w:tc>
+        <w:tc>
+          <w:tcPr>
+            <w:tcW w:type="dxa" w:w="1500"/>
+            <w:tcBorders>
+              <w:top w:val="single" w:color="000000" w:sz="4"/>
+              <w:left w:val="single" w:color="000000" w:sz="4"/>
+              <w:bottom w:val="single" w:color="000000" w:sz="4"/>
+              <w:right w:val="single" w:color="000000" w:sz="4"/>
+            </w:tcBorders>
+            <w:tcMar>
+              <w:top w:type="dxa" w:w="20"/>
+              <w:left w:type="dxa" w:w="80"/>
+              <w:bottom w:type="dxa" w:w="20"/>
+              <w:right w:type="dxa" w:w="80"/>
+            </w:tcMar>
+            <w:vAlign w:val="center"/>
+          </w:tcPr>
+          <w:p>
+            <w:pPr>
+              <w:spacing w:line="240"/>
+              <w:ind w:firstLine="0"/>
+              <w:jc w:val="left"/>
+            </w:pPr>
+            <w:r>
+              <w:rPr>
+                <w:rFonts w:ascii="Times New Roman" w:cs="Times New Roman" w:eastAsia="Times New Roman" w:hAnsi="Times New Roman"/>
+                <w:sz w:val="22"/>
+                <w:szCs w:val="22"/>
+              </w:rPr>
+              <w:t xml:space="preserve">int</w:t>
+            </w:r>
+          </w:p>
+        </w:tc>
+        <w:tc>
+          <w:tcPr>
+            <w:tcW w:type="dxa" w:w="3022"/>
+            <w:tcBorders>
+              <w:top w:val="single" w:color="000000" w:sz="4"/>
+              <w:left w:val="single" w:color="000000" w:sz="4"/>
+              <w:bottom w:val="single" w:color="000000" w:sz="4"/>
+              <w:right w:val="single" w:color="000000" w:sz="4"/>
+            </w:tcBorders>
+            <w:tcMar>
+              <w:top w:type="dxa" w:w="20"/>
+              <w:left w:type="dxa" w:w="80"/>
+              <w:bottom w:type="dxa" w:w="20"/>
+              <w:right w:type="dxa" w:w="80"/>
+            </w:tcMar>
+            <w:vAlign w:val="center"/>
+          </w:tcPr>
+          <w:p>
+            <w:pPr>
+              <w:spacing w:line="240"/>
+              <w:ind w:firstLine="0"/>
+              <w:jc w:val="left"/>
+            </w:pPr>
+            <w:r>
+              <w:rPr>
+                <w:rFonts w:ascii="Times New Roman" w:cs="Times New Roman" w:eastAsia="Times New Roman" w:hAnsi="Times New Roman"/>
+                <w:sz w:val="22"/>
+                <w:szCs w:val="22"/>
+              </w:rPr>
+              <w:t xml:space="preserve">Высота поля ввода, пикс. (методические указания, табл. 2.1)</w:t>
+            </w:r>
+          </w:p>
+        </w:tc>
+      </w:tr>
+      <w:tr>
+        <w:trPr>
+          <w:cantSplit/>
+        </w:trPr>
+        <w:tc>
+          <w:tcPr>
+            <w:tcW w:type="dxa" w:w="3750"/>
+            <w:tcBorders>
+              <w:top w:val="single" w:color="000000" w:sz="4"/>
+              <w:left w:val="single" w:color="000000" w:sz="4"/>
+              <w:bottom w:val="single" w:color="000000" w:sz="4"/>
+              <w:right w:val="single" w:color="000000" w:sz="4"/>
+            </w:tcBorders>
+            <w:tcMar>
+              <w:top w:type="dxa" w:w="20"/>
+              <w:left w:type="dxa" w:w="80"/>
+              <w:bottom w:type="dxa" w:w="20"/>
+              <w:right w:type="dxa" w:w="80"/>
+            </w:tcMar>
+            <w:vAlign w:val="center"/>
+          </w:tcPr>
+          <w:p>
+            <w:pPr>
+              <w:spacing w:line="240"/>
+              <w:ind w:firstLine="0"/>
+              <w:jc w:val="left"/>
+            </w:pPr>
+            <w:r>
+              <w:rPr>
+                <w:rFonts w:ascii="Courier New" w:cs="Courier New" w:eastAsia="Courier New" w:hAnsi="Courier New"/>
+                <w:sz w:val="17"/>
+                <w:szCs w:val="17"/>
+              </w:rPr>
+              <w:t xml:space="preserve">Ui.GapRelated</w:t>
+            </w:r>
+          </w:p>
+        </w:tc>
+        <w:tc>
+          <w:tcPr>
+            <w:tcW w:type="dxa" w:w="1650"/>
+            <w:tcBorders>
+              <w:top w:val="single" w:color="000000" w:sz="4"/>
+              <w:left w:val="single" w:color="000000" w:sz="4"/>
+              <w:bottom w:val="single" w:color="000000" w:sz="4"/>
+              <w:right w:val="single" w:color="000000" w:sz="4"/>
+            </w:tcBorders>
+            <w:tcMar>
+              <w:top w:type="dxa" w:w="20"/>
+              <w:left w:type="dxa" w:w="80"/>
+              <w:bottom w:type="dxa" w:w="20"/>
+              <w:right w:type="dxa" w:w="80"/>
+            </w:tcMar>
+            <w:vAlign w:val="center"/>
+          </w:tcPr>
+          <w:p>
+            <w:pPr>
+              <w:spacing w:line="240"/>
+              <w:ind w:firstLine="0"/>
+              <w:jc w:val="left"/>
+            </w:pPr>
+            <w:r>
+              <w:rPr>
+                <w:rFonts w:ascii="Times New Roman" w:cs="Times New Roman" w:eastAsia="Times New Roman" w:hAnsi="Times New Roman"/>
+                <w:sz w:val="22"/>
+                <w:szCs w:val="22"/>
+              </w:rPr>
+              <w:t xml:space="preserve">5</w:t>
+            </w:r>
+          </w:p>
+        </w:tc>
+        <w:tc>
+          <w:tcPr>
+            <w:tcW w:type="dxa" w:w="1500"/>
+            <w:tcBorders>
+              <w:top w:val="single" w:color="000000" w:sz="4"/>
+              <w:left w:val="single" w:color="000000" w:sz="4"/>
+              <w:bottom w:val="single" w:color="000000" w:sz="4"/>
+              <w:right w:val="single" w:color="000000" w:sz="4"/>
+            </w:tcBorders>
+            <w:tcMar>
+              <w:top w:type="dxa" w:w="20"/>
+              <w:left w:type="dxa" w:w="80"/>
+              <w:bottom w:type="dxa" w:w="20"/>
+              <w:right w:type="dxa" w:w="80"/>
+            </w:tcMar>
+            <w:vAlign w:val="center"/>
+          </w:tcPr>
+          <w:p>
+            <w:pPr>
+              <w:spacing w:line="240"/>
+              <w:ind w:firstLine="0"/>
+              <w:jc w:val="left"/>
+            </w:pPr>
+            <w:r>
+              <w:rPr>
+                <w:rFonts w:ascii="Times New Roman" w:cs="Times New Roman" w:eastAsia="Times New Roman" w:hAnsi="Times New Roman"/>
+                <w:sz w:val="22"/>
+                <w:szCs w:val="22"/>
+              </w:rPr>
+              <w:t xml:space="preserve">int</w:t>
+            </w:r>
+          </w:p>
+        </w:tc>
+        <w:tc>
+          <w:tcPr>
+            <w:tcW w:type="dxa" w:w="3022"/>
+            <w:tcBorders>
+              <w:top w:val="single" w:color="000000" w:sz="4"/>
+              <w:left w:val="single" w:color="000000" w:sz="4"/>
+              <w:bottom w:val="single" w:color="000000" w:sz="4"/>
+              <w:right w:val="single" w:color="000000" w:sz="4"/>
+            </w:tcBorders>
+            <w:tcMar>
+              <w:top w:type="dxa" w:w="20"/>
+              <w:left w:type="dxa" w:w="80"/>
+              <w:bottom w:type="dxa" w:w="20"/>
+              <w:right w:type="dxa" w:w="80"/>
+            </w:tcMar>
+            <w:vAlign w:val="center"/>
+          </w:tcPr>
+          <w:p>
+            <w:pPr>
+              <w:spacing w:line="240"/>
+              <w:ind w:firstLine="0"/>
+              <w:jc w:val="left"/>
+            </w:pPr>
+            <w:r>
+              <w:rPr>
+                <w:rFonts w:ascii="Times New Roman" w:cs="Times New Roman" w:eastAsia="Times New Roman" w:hAnsi="Times New Roman"/>
+                <w:sz w:val="22"/>
+                <w:szCs w:val="22"/>
+              </w:rPr>
+              <w:t xml:space="preserve">Интервал между связанными элементами, пикс.</w:t>
+            </w:r>
+          </w:p>
+        </w:tc>
+      </w:tr>
+      <w:tr>
+        <w:trPr>
+          <w:cantSplit/>
+        </w:trPr>
+        <w:tc>
+          <w:tcPr>
+            <w:tcW w:type="dxa" w:w="3750"/>
+            <w:tcBorders>
+              <w:top w:val="single" w:color="000000" w:sz="4"/>
+              <w:left w:val="single" w:color="000000" w:sz="4"/>
+              <w:bottom w:val="single" w:color="000000" w:sz="4"/>
+              <w:right w:val="single" w:color="000000" w:sz="4"/>
+            </w:tcBorders>
+            <w:tcMar>
+              <w:top w:type="dxa" w:w="20"/>
+              <w:left w:type="dxa" w:w="80"/>
+              <w:bottom w:type="dxa" w:w="20"/>
+              <w:right w:type="dxa" w:w="80"/>
+            </w:tcMar>
+            <w:vAlign w:val="center"/>
+          </w:tcPr>
+          <w:p>
+            <w:pPr>
+              <w:spacing w:line="240"/>
+              <w:ind w:firstLine="0"/>
+              <w:jc w:val="left"/>
+            </w:pPr>
+            <w:r>
+              <w:rPr>
+                <w:rFonts w:ascii="Courier New" w:cs="Courier New" w:eastAsia="Courier New" w:hAnsi="Courier New"/>
+                <w:sz w:val="17"/>
+                <w:szCs w:val="17"/>
+              </w:rPr>
+              <w:t xml:space="preserve">Ui.GapUnrelated</w:t>
+            </w:r>
+          </w:p>
+        </w:tc>
+        <w:tc>
+          <w:tcPr>
+            <w:tcW w:type="dxa" w:w="1650"/>
+            <w:tcBorders>
+              <w:top w:val="single" w:color="000000" w:sz="4"/>
+              <w:left w:val="single" w:color="000000" w:sz="4"/>
+              <w:bottom w:val="single" w:color="000000" w:sz="4"/>
+              <w:right w:val="single" w:color="000000" w:sz="4"/>
+            </w:tcBorders>
+            <w:tcMar>
+              <w:top w:type="dxa" w:w="20"/>
+              <w:left w:type="dxa" w:w="80"/>
+              <w:bottom w:type="dxa" w:w="20"/>
+              <w:right w:type="dxa" w:w="80"/>
+            </w:tcMar>
+            <w:vAlign w:val="center"/>
+          </w:tcPr>
+          <w:p>
+            <w:pPr>
+              <w:spacing w:line="240"/>
+              <w:ind w:firstLine="0"/>
+              <w:jc w:val="left"/>
+            </w:pPr>
+            <w:r>
+              <w:rPr>
+                <w:rFonts w:ascii="Times New Roman" w:cs="Times New Roman" w:eastAsia="Times New Roman" w:hAnsi="Times New Roman"/>
+                <w:sz w:val="22"/>
+                <w:szCs w:val="22"/>
+              </w:rPr>
+              <w:t xml:space="preserve">8</w:t>
+            </w:r>
+          </w:p>
+        </w:tc>
+        <w:tc>
+          <w:tcPr>
+            <w:tcW w:type="dxa" w:w="1500"/>
+            <w:tcBorders>
+              <w:top w:val="single" w:color="000000" w:sz="4"/>
+              <w:left w:val="single" w:color="000000" w:sz="4"/>
+              <w:bottom w:val="single" w:color="000000" w:sz="4"/>
+              <w:right w:val="single" w:color="000000" w:sz="4"/>
+            </w:tcBorders>
+            <w:tcMar>
+              <w:top w:type="dxa" w:w="20"/>
+              <w:left w:type="dxa" w:w="80"/>
+              <w:bottom w:type="dxa" w:w="20"/>
+              <w:right w:type="dxa" w:w="80"/>
+            </w:tcMar>
+            <w:vAlign w:val="center"/>
+          </w:tcPr>
+          <w:p>
+            <w:pPr>
+              <w:spacing w:line="240"/>
+              <w:ind w:firstLine="0"/>
+              <w:jc w:val="left"/>
+            </w:pPr>
+            <w:r>
+              <w:rPr>
+                <w:rFonts w:ascii="Times New Roman" w:cs="Times New Roman" w:eastAsia="Times New Roman" w:hAnsi="Times New Roman"/>
+                <w:sz w:val="22"/>
+                <w:szCs w:val="22"/>
+              </w:rPr>
+              <w:t xml:space="preserve">int</w:t>
+            </w:r>
+          </w:p>
+        </w:tc>
+        <w:tc>
+          <w:tcPr>
+            <w:tcW w:type="dxa" w:w="3022"/>
+            <w:tcBorders>
+              <w:top w:val="single" w:color="000000" w:sz="4"/>
+              <w:left w:val="single" w:color="000000" w:sz="4"/>
+              <w:bottom w:val="single" w:color="000000" w:sz="4"/>
+              <w:right w:val="single" w:color="000000" w:sz="4"/>
+            </w:tcBorders>
+            <w:tcMar>
+              <w:top w:type="dxa" w:w="20"/>
+              <w:left w:type="dxa" w:w="80"/>
+              <w:bottom w:type="dxa" w:w="20"/>
+              <w:right w:type="dxa" w:w="80"/>
+            </w:tcMar>
+            <w:vAlign w:val="center"/>
+          </w:tcPr>
+          <w:p>
+            <w:pPr>
+              <w:spacing w:line="240"/>
+              <w:ind w:firstLine="0"/>
+              <w:jc w:val="left"/>
+            </w:pPr>
+            <w:r>
+              <w:rPr>
+                <w:rFonts w:ascii="Times New Roman" w:cs="Times New Roman" w:eastAsia="Times New Roman" w:hAnsi="Times New Roman"/>
+                <w:sz w:val="22"/>
+                <w:szCs w:val="22"/>
+              </w:rPr>
+              <w:t xml:space="preserve">Интервал между несвязанными элементами, пикс.</w:t>
+            </w:r>
+          </w:p>
+        </w:tc>
+      </w:tr>
+      <w:tr>
+        <w:trPr>
+          <w:cantSplit/>
+        </w:trPr>
+        <w:tc>
+          <w:tcPr>
+            <w:tcW w:type="dxa" w:w="3750"/>
+            <w:tcBorders>
+              <w:top w:val="single" w:color="000000" w:sz="4"/>
+              <w:left w:val="single" w:color="000000" w:sz="4"/>
+              <w:bottom w:val="single" w:color="000000" w:sz="4"/>
+              <w:right w:val="single" w:color="000000" w:sz="4"/>
+            </w:tcBorders>
+            <w:tcMar>
+              <w:top w:type="dxa" w:w="20"/>
+              <w:left w:type="dxa" w:w="80"/>
+              <w:bottom w:type="dxa" w:w="20"/>
+              <w:right w:type="dxa" w:w="80"/>
+            </w:tcMar>
+            <w:vAlign w:val="center"/>
+          </w:tcPr>
+          <w:p>
+            <w:pPr>
+              <w:spacing w:line="240"/>
+              <w:ind w:firstLine="0"/>
+              <w:jc w:val="left"/>
+            </w:pPr>
+            <w:r>
+              <w:rPr>
+                <w:rFonts w:ascii="Courier New" w:cs="Courier New" w:eastAsia="Courier New" w:hAnsi="Courier New"/>
+                <w:sz w:val="17"/>
+                <w:szCs w:val="17"/>
+              </w:rPr>
+              <w:t xml:space="preserve">PlotPanel.MaxNodesShown</w:t>
+            </w:r>
+          </w:p>
+        </w:tc>
+        <w:tc>
+          <w:tcPr>
+            <w:tcW w:type="dxa" w:w="1650"/>
+            <w:tcBorders>
+              <w:top w:val="single" w:color="000000" w:sz="4"/>
+              <w:left w:val="single" w:color="000000" w:sz="4"/>
+              <w:bottom w:val="single" w:color="000000" w:sz="4"/>
+              <w:right w:val="single" w:color="000000" w:sz="4"/>
+            </w:tcBorders>
+            <w:tcMar>
+              <w:top w:type="dxa" w:w="20"/>
+              <w:left w:type="dxa" w:w="80"/>
+              <w:bottom w:type="dxa" w:w="20"/>
+              <w:right w:type="dxa" w:w="80"/>
+            </w:tcMar>
+            <w:vAlign w:val="center"/>
+          </w:tcPr>
+          <w:p>
+            <w:pPr>
+              <w:spacing w:line="240"/>
+              <w:ind w:firstLine="0"/>
+              <w:jc w:val="left"/>
+            </w:pPr>
+            <w:r>
+              <w:rPr>
+                <w:rFonts w:ascii="Times New Roman" w:cs="Times New Roman" w:eastAsia="Times New Roman" w:hAnsi="Times New Roman"/>
+                <w:sz w:val="22"/>
+                <w:szCs w:val="22"/>
+              </w:rPr>
+              <w:t xml:space="preserve">64</w:t>
+            </w:r>
+          </w:p>
+        </w:tc>
+        <w:tc>
+          <w:tcPr>
+            <w:tcW w:type="dxa" w:w="1500"/>
+            <w:tcBorders>
+              <w:top w:val="single" w:color="000000" w:sz="4"/>
+              <w:left w:val="single" w:color="000000" w:sz="4"/>
+              <w:bottom w:val="single" w:color="000000" w:sz="4"/>
+              <w:right w:val="single" w:color="000000" w:sz="4"/>
+            </w:tcBorders>
+            <w:tcMar>
+              <w:top w:type="dxa" w:w="20"/>
+              <w:left w:type="dxa" w:w="80"/>
+              <w:bottom w:type="dxa" w:w="20"/>
+              <w:right w:type="dxa" w:w="80"/>
+            </w:tcMar>
+            <w:vAlign w:val="center"/>
+          </w:tcPr>
+          <w:p>
+            <w:pPr>
+              <w:spacing w:line="240"/>
+              <w:ind w:firstLine="0"/>
+              <w:jc w:val="left"/>
+            </w:pPr>
+            <w:r>
+              <w:rPr>
+                <w:rFonts w:ascii="Times New Roman" w:cs="Times New Roman" w:eastAsia="Times New Roman" w:hAnsi="Times New Roman"/>
+                <w:sz w:val="22"/>
+                <w:szCs w:val="22"/>
+              </w:rPr>
+              <w:t xml:space="preserve">int</w:t>
+            </w:r>
+          </w:p>
+        </w:tc>
+        <w:tc>
+          <w:tcPr>
+            <w:tcW w:type="dxa" w:w="3022"/>
+            <w:tcBorders>
+              <w:top w:val="single" w:color="000000" w:sz="4"/>
+              <w:left w:val="single" w:color="000000" w:sz="4"/>
+              <w:bottom w:val="single" w:color="000000" w:sz="4"/>
+              <w:right w:val="single" w:color="000000" w:sz="4"/>
+            </w:tcBorders>
+            <w:tcMar>
+              <w:top w:type="dxa" w:w="20"/>
+              <w:left w:type="dxa" w:w="80"/>
+              <w:bottom w:type="dxa" w:w="20"/>
+              <w:right w:type="dxa" w:w="80"/>
+            </w:tcMar>
+            <w:vAlign w:val="center"/>
+          </w:tcPr>
+          <w:p>
+            <w:pPr>
+              <w:spacing w:line="240"/>
+              <w:ind w:firstLine="0"/>
+              <w:jc w:val="left"/>
+            </w:pPr>
+            <w:r>
+              <w:rPr>
+                <w:rFonts w:ascii="Times New Roman" w:cs="Times New Roman" w:eastAsia="Times New Roman" w:hAnsi="Times New Roman"/>
+                <w:sz w:val="22"/>
+                <w:szCs w:val="22"/>
+              </w:rPr>
+              <w:t xml:space="preserve">Наибольшее n, при котором на графике показываются узлы разбиения</w:t>
+            </w:r>
+          </w:p>
+        </w:tc>
+      </w:tr>
+      <w:tr>
+        <w:trPr>
+          <w:cantSplit/>
+        </w:trPr>
+        <w:tc>
+          <w:tcPr>
+            <w:tcW w:type="dxa" w:w="3750"/>
+            <w:tcBorders>
+              <w:top w:val="single" w:color="000000" w:sz="4"/>
+              <w:left w:val="single" w:color="000000" w:sz="4"/>
+              <w:bottom w:val="single" w:color="000000" w:sz="4"/>
+              <w:right w:val="single" w:color="000000" w:sz="4"/>
+            </w:tcBorders>
+            <w:tcMar>
+              <w:top w:type="dxa" w:w="20"/>
+              <w:left w:type="dxa" w:w="80"/>
+              <w:bottom w:type="dxa" w:w="20"/>
+              <w:right w:type="dxa" w:w="80"/>
+            </w:tcMar>
+            <w:vAlign w:val="center"/>
+          </w:tcPr>
+          <w:p>
+            <w:pPr>
+              <w:spacing w:line="240"/>
+              <w:ind w:firstLine="0"/>
+              <w:jc w:val="left"/>
+            </w:pPr>
+            <w:r>
+              <w:rPr>
+                <w:rFonts w:ascii="Courier New" w:cs="Courier New" w:eastAsia="Courier New" w:hAnsi="Courier New"/>
+                <w:sz w:val="17"/>
+                <w:szCs w:val="17"/>
+              </w:rPr>
               <w:t xml:space="preserve">TokenType</w:t>
             </w:r>
           </w:p>
@@ -14488,6 +15036,2335 @@
                 <w:sz w:val="17"/>
                 <w:szCs w:val="17"/>
               </w:rPr>
+              <w:t xml:space="preserve">NumberParser.TryParse</w:t>
+            </w:r>
+          </w:p>
+        </w:tc>
+        <w:tc>
+          <w:tcPr>
+            <w:tcW w:type="dxa" w:w="3000"/>
+            <w:tcBorders>
+              <w:top w:val="single" w:color="000000" w:sz="4"/>
+              <w:left w:val="single" w:color="000000" w:sz="4"/>
+              <w:bottom w:val="single" w:color="000000" w:sz="4"/>
+              <w:right w:val="single" w:color="000000" w:sz="4"/>
+            </w:tcBorders>
+            <w:tcMar>
+              <w:top w:type="dxa" w:w="20"/>
+              <w:left w:type="dxa" w:w="80"/>
+              <w:bottom w:type="dxa" w:w="20"/>
+              <w:right w:type="dxa" w:w="80"/>
+            </w:tcMar>
+            <w:vAlign w:val="center"/>
+          </w:tcPr>
+          <w:p>
+            <w:pPr>
+              <w:spacing w:line="240"/>
+              <w:ind w:firstLine="0"/>
+              <w:jc w:val="left"/>
+            </w:pPr>
+            <w:r>
+              <w:rPr>
+                <w:rFonts w:ascii="Times New Roman" w:cs="Times New Roman" w:eastAsia="Times New Roman" w:hAnsi="Times New Roman"/>
+                <w:sz w:val="22"/>
+                <w:szCs w:val="22"/>
+              </w:rPr>
+              <w:t xml:space="preserve">string text, out double value</w:t>
+            </w:r>
+          </w:p>
+        </w:tc>
+        <w:tc>
+          <w:tcPr>
+            <w:tcW w:type="dxa" w:w="1500"/>
+            <w:tcBorders>
+              <w:top w:val="single" w:color="000000" w:sz="4"/>
+              <w:left w:val="single" w:color="000000" w:sz="4"/>
+              <w:bottom w:val="single" w:color="000000" w:sz="4"/>
+              <w:right w:val="single" w:color="000000" w:sz="4"/>
+            </w:tcBorders>
+            <w:tcMar>
+              <w:top w:type="dxa" w:w="20"/>
+              <w:left w:type="dxa" w:w="80"/>
+              <w:bottom w:type="dxa" w:w="20"/>
+              <w:right w:type="dxa" w:w="80"/>
+            </w:tcMar>
+            <w:vAlign w:val="center"/>
+          </w:tcPr>
+          <w:p>
+            <w:pPr>
+              <w:spacing w:line="240"/>
+              <w:ind w:firstLine="0"/>
+              <w:jc w:val="left"/>
+            </w:pPr>
+            <w:r>
+              <w:rPr>
+                <w:rFonts w:ascii="Times New Roman" w:cs="Times New Roman" w:eastAsia="Times New Roman" w:hAnsi="Times New Roman"/>
+                <w:sz w:val="22"/>
+                <w:szCs w:val="22"/>
+              </w:rPr>
+              <w:t xml:space="preserve">bool</w:t>
+            </w:r>
+          </w:p>
+        </w:tc>
+        <w:tc>
+          <w:tcPr>
+            <w:tcW w:type="dxa" w:w="2922"/>
+            <w:tcBorders>
+              <w:top w:val="single" w:color="000000" w:sz="4"/>
+              <w:left w:val="single" w:color="000000" w:sz="4"/>
+              <w:bottom w:val="single" w:color="000000" w:sz="4"/>
+              <w:right w:val="single" w:color="000000" w:sz="4"/>
+            </w:tcBorders>
+            <w:tcMar>
+              <w:top w:type="dxa" w:w="20"/>
+              <w:left w:type="dxa" w:w="80"/>
+              <w:bottom w:type="dxa" w:w="20"/>
+              <w:right w:type="dxa" w:w="80"/>
+            </w:tcMar>
+            <w:vAlign w:val="center"/>
+          </w:tcPr>
+          <w:p>
+            <w:pPr>
+              <w:spacing w:line="240"/>
+              <w:ind w:firstLine="0"/>
+              <w:jc w:val="left"/>
+            </w:pPr>
+            <w:r>
+              <w:rPr>
+                <w:rFonts w:ascii="Times New Roman" w:cs="Times New Roman" w:eastAsia="Times New Roman" w:hAnsi="Times New Roman"/>
+                <w:sz w:val="22"/>
+                <w:szCs w:val="22"/>
+              </w:rPr>
+              <w:t xml:space="preserve">Читает число из поля ввода (точка или запятая)</w:t>
+            </w:r>
+          </w:p>
+        </w:tc>
+      </w:tr>
+      <w:tr>
+        <w:trPr>
+          <w:cantSplit/>
+        </w:trPr>
+        <w:tc>
+          <w:tcPr>
+            <w:tcW w:type="dxa" w:w="2500"/>
+            <w:tcBorders>
+              <w:top w:val="single" w:color="000000" w:sz="4"/>
+              <w:left w:val="single" w:color="000000" w:sz="4"/>
+              <w:bottom w:val="single" w:color="000000" w:sz="4"/>
+              <w:right w:val="single" w:color="000000" w:sz="4"/>
+            </w:tcBorders>
+            <w:tcMar>
+              <w:top w:type="dxa" w:w="20"/>
+              <w:left w:type="dxa" w:w="80"/>
+              <w:bottom w:type="dxa" w:w="20"/>
+              <w:right w:type="dxa" w:w="80"/>
+            </w:tcMar>
+            <w:vAlign w:val="center"/>
+          </w:tcPr>
+          <w:p>
+            <w:pPr>
+              <w:spacing w:line="240"/>
+              <w:ind w:firstLine="0"/>
+              <w:jc w:val="left"/>
+            </w:pPr>
+            <w:r>
+              <w:rPr>
+                <w:rFonts w:ascii="Courier New" w:cs="Courier New" w:eastAsia="Courier New" w:hAnsi="Courier New"/>
+                <w:sz w:val="17"/>
+                <w:szCs w:val="17"/>
+              </w:rPr>
+              <w:t xml:space="preserve">AxisScale.NiceStep</w:t>
+            </w:r>
+          </w:p>
+        </w:tc>
+        <w:tc>
+          <w:tcPr>
+            <w:tcW w:type="dxa" w:w="3000"/>
+            <w:tcBorders>
+              <w:top w:val="single" w:color="000000" w:sz="4"/>
+              <w:left w:val="single" w:color="000000" w:sz="4"/>
+              <w:bottom w:val="single" w:color="000000" w:sz="4"/>
+              <w:right w:val="single" w:color="000000" w:sz="4"/>
+            </w:tcBorders>
+            <w:tcMar>
+              <w:top w:type="dxa" w:w="20"/>
+              <w:left w:type="dxa" w:w="80"/>
+              <w:bottom w:type="dxa" w:w="20"/>
+              <w:right w:type="dxa" w:w="80"/>
+            </w:tcMar>
+            <w:vAlign w:val="center"/>
+          </w:tcPr>
+          <w:p>
+            <w:pPr>
+              <w:spacing w:line="240"/>
+              <w:ind w:firstLine="0"/>
+              <w:jc w:val="left"/>
+            </w:pPr>
+            <w:r>
+              <w:rPr>
+                <w:rFonts w:ascii="Times New Roman" w:cs="Times New Roman" w:eastAsia="Times New Roman" w:hAnsi="Times New Roman"/>
+                <w:sz w:val="22"/>
+                <w:szCs w:val="22"/>
+              </w:rPr>
+              <w:t xml:space="preserve">double min, double max, int target</w:t>
+            </w:r>
+          </w:p>
+        </w:tc>
+        <w:tc>
+          <w:tcPr>
+            <w:tcW w:type="dxa" w:w="1500"/>
+            <w:tcBorders>
+              <w:top w:val="single" w:color="000000" w:sz="4"/>
+              <w:left w:val="single" w:color="000000" w:sz="4"/>
+              <w:bottom w:val="single" w:color="000000" w:sz="4"/>
+              <w:right w:val="single" w:color="000000" w:sz="4"/>
+            </w:tcBorders>
+            <w:tcMar>
+              <w:top w:type="dxa" w:w="20"/>
+              <w:left w:type="dxa" w:w="80"/>
+              <w:bottom w:type="dxa" w:w="20"/>
+              <w:right w:type="dxa" w:w="80"/>
+            </w:tcMar>
+            <w:vAlign w:val="center"/>
+          </w:tcPr>
+          <w:p>
+            <w:pPr>
+              <w:spacing w:line="240"/>
+              <w:ind w:firstLine="0"/>
+              <w:jc w:val="left"/>
+            </w:pPr>
+            <w:r>
+              <w:rPr>
+                <w:rFonts w:ascii="Times New Roman" w:cs="Times New Roman" w:eastAsia="Times New Roman" w:hAnsi="Times New Roman"/>
+                <w:sz w:val="22"/>
+                <w:szCs w:val="22"/>
+              </w:rPr>
+              <w:t xml:space="preserve">double</w:t>
+            </w:r>
+          </w:p>
+        </w:tc>
+        <w:tc>
+          <w:tcPr>
+            <w:tcW w:type="dxa" w:w="2922"/>
+            <w:tcBorders>
+              <w:top w:val="single" w:color="000000" w:sz="4"/>
+              <w:left w:val="single" w:color="000000" w:sz="4"/>
+              <w:bottom w:val="single" w:color="000000" w:sz="4"/>
+              <w:right w:val="single" w:color="000000" w:sz="4"/>
+            </w:tcBorders>
+            <w:tcMar>
+              <w:top w:type="dxa" w:w="20"/>
+              <w:left w:type="dxa" w:w="80"/>
+              <w:bottom w:type="dxa" w:w="20"/>
+              <w:right w:type="dxa" w:w="80"/>
+            </w:tcMar>
+            <w:vAlign w:val="center"/>
+          </w:tcPr>
+          <w:p>
+            <w:pPr>
+              <w:spacing w:line="240"/>
+              <w:ind w:firstLine="0"/>
+              <w:jc w:val="left"/>
+            </w:pPr>
+            <w:r>
+              <w:rPr>
+                <w:rFonts w:ascii="Times New Roman" w:cs="Times New Roman" w:eastAsia="Times New Roman" w:hAnsi="Times New Roman"/>
+                <w:sz w:val="22"/>
+                <w:szCs w:val="22"/>
+              </w:rPr>
+              <w:t xml:space="preserve">Подбирает шаг делений оси из ряда 1, 2, 5 x 10^k</w:t>
+            </w:r>
+          </w:p>
+        </w:tc>
+      </w:tr>
+      <w:tr>
+        <w:trPr>
+          <w:cantSplit/>
+        </w:trPr>
+        <w:tc>
+          <w:tcPr>
+            <w:tcW w:type="dxa" w:w="2500"/>
+            <w:tcBorders>
+              <w:top w:val="single" w:color="000000" w:sz="4"/>
+              <w:left w:val="single" w:color="000000" w:sz="4"/>
+              <w:bottom w:val="single" w:color="000000" w:sz="4"/>
+              <w:right w:val="single" w:color="000000" w:sz="4"/>
+            </w:tcBorders>
+            <w:tcMar>
+              <w:top w:type="dxa" w:w="20"/>
+              <w:left w:type="dxa" w:w="80"/>
+              <w:bottom w:type="dxa" w:w="20"/>
+              <w:right w:type="dxa" w:w="80"/>
+            </w:tcMar>
+            <w:vAlign w:val="center"/>
+          </w:tcPr>
+          <w:p>
+            <w:pPr>
+              <w:spacing w:line="240"/>
+              <w:ind w:firstLine="0"/>
+              <w:jc w:val="left"/>
+            </w:pPr>
+            <w:r>
+              <w:rPr>
+                <w:rFonts w:ascii="Courier New" w:cs="Courier New" w:eastAsia="Courier New" w:hAnsi="Courier New"/>
+                <w:sz w:val="17"/>
+                <w:szCs w:val="17"/>
+              </w:rPr>
+              <w:t xml:space="preserve">AxisScale.Ticks</w:t>
+            </w:r>
+          </w:p>
+        </w:tc>
+        <w:tc>
+          <w:tcPr>
+            <w:tcW w:type="dxa" w:w="3000"/>
+            <w:tcBorders>
+              <w:top w:val="single" w:color="000000" w:sz="4"/>
+              <w:left w:val="single" w:color="000000" w:sz="4"/>
+              <w:bottom w:val="single" w:color="000000" w:sz="4"/>
+              <w:right w:val="single" w:color="000000" w:sz="4"/>
+            </w:tcBorders>
+            <w:tcMar>
+              <w:top w:type="dxa" w:w="20"/>
+              <w:left w:type="dxa" w:w="80"/>
+              <w:bottom w:type="dxa" w:w="20"/>
+              <w:right w:type="dxa" w:w="80"/>
+            </w:tcMar>
+            <w:vAlign w:val="center"/>
+          </w:tcPr>
+          <w:p>
+            <w:pPr>
+              <w:spacing w:line="240"/>
+              <w:ind w:firstLine="0"/>
+              <w:jc w:val="left"/>
+            </w:pPr>
+            <w:r>
+              <w:rPr>
+                <w:rFonts w:ascii="Times New Roman" w:cs="Times New Roman" w:eastAsia="Times New Roman" w:hAnsi="Times New Roman"/>
+                <w:sz w:val="22"/>
+                <w:szCs w:val="22"/>
+              </w:rPr>
+              <w:t xml:space="preserve">double min, double max, int target</w:t>
+            </w:r>
+          </w:p>
+        </w:tc>
+        <w:tc>
+          <w:tcPr>
+            <w:tcW w:type="dxa" w:w="1500"/>
+            <w:tcBorders>
+              <w:top w:val="single" w:color="000000" w:sz="4"/>
+              <w:left w:val="single" w:color="000000" w:sz="4"/>
+              <w:bottom w:val="single" w:color="000000" w:sz="4"/>
+              <w:right w:val="single" w:color="000000" w:sz="4"/>
+            </w:tcBorders>
+            <w:tcMar>
+              <w:top w:type="dxa" w:w="20"/>
+              <w:left w:type="dxa" w:w="80"/>
+              <w:bottom w:type="dxa" w:w="20"/>
+              <w:right w:type="dxa" w:w="80"/>
+            </w:tcMar>
+            <w:vAlign w:val="center"/>
+          </w:tcPr>
+          <w:p>
+            <w:pPr>
+              <w:spacing w:line="240"/>
+              <w:ind w:firstLine="0"/>
+              <w:jc w:val="left"/>
+            </w:pPr>
+            <w:r>
+              <w:rPr>
+                <w:rFonts w:ascii="Times New Roman" w:cs="Times New Roman" w:eastAsia="Times New Roman" w:hAnsi="Times New Roman"/>
+                <w:sz w:val="22"/>
+                <w:szCs w:val="22"/>
+              </w:rPr>
+              <w:t xml:space="preserve">IList&lt;double&gt;</w:t>
+            </w:r>
+          </w:p>
+        </w:tc>
+        <w:tc>
+          <w:tcPr>
+            <w:tcW w:type="dxa" w:w="2922"/>
+            <w:tcBorders>
+              <w:top w:val="single" w:color="000000" w:sz="4"/>
+              <w:left w:val="single" w:color="000000" w:sz="4"/>
+              <w:bottom w:val="single" w:color="000000" w:sz="4"/>
+              <w:right w:val="single" w:color="000000" w:sz="4"/>
+            </w:tcBorders>
+            <w:tcMar>
+              <w:top w:type="dxa" w:w="20"/>
+              <w:left w:type="dxa" w:w="80"/>
+              <w:bottom w:type="dxa" w:w="20"/>
+              <w:right w:type="dxa" w:w="80"/>
+            </w:tcMar>
+            <w:vAlign w:val="center"/>
+          </w:tcPr>
+          <w:p>
+            <w:pPr>
+              <w:spacing w:line="240"/>
+              <w:ind w:firstLine="0"/>
+              <w:jc w:val="left"/>
+            </w:pPr>
+            <w:r>
+              <w:rPr>
+                <w:rFonts w:ascii="Times New Roman" w:cs="Times New Roman" w:eastAsia="Times New Roman" w:hAnsi="Times New Roman"/>
+                <w:sz w:val="22"/>
+                <w:szCs w:val="22"/>
+              </w:rPr>
+              <w:t xml:space="preserve">Значения делений оси внутри диапазона</w:t>
+            </w:r>
+          </w:p>
+        </w:tc>
+      </w:tr>
+      <w:tr>
+        <w:trPr>
+          <w:cantSplit/>
+        </w:trPr>
+        <w:tc>
+          <w:tcPr>
+            <w:tcW w:type="dxa" w:w="2500"/>
+            <w:tcBorders>
+              <w:top w:val="single" w:color="000000" w:sz="4"/>
+              <w:left w:val="single" w:color="000000" w:sz="4"/>
+              <w:bottom w:val="single" w:color="000000" w:sz="4"/>
+              <w:right w:val="single" w:color="000000" w:sz="4"/>
+            </w:tcBorders>
+            <w:tcMar>
+              <w:top w:type="dxa" w:w="20"/>
+              <w:left w:type="dxa" w:w="80"/>
+              <w:bottom w:type="dxa" w:w="20"/>
+              <w:right w:type="dxa" w:w="80"/>
+            </w:tcMar>
+            <w:vAlign w:val="center"/>
+          </w:tcPr>
+          <w:p>
+            <w:pPr>
+              <w:spacing w:line="240"/>
+              <w:ind w:firstLine="0"/>
+              <w:jc w:val="left"/>
+            </w:pPr>
+            <w:r>
+              <w:rPr>
+                <w:rFonts w:ascii="Courier New" w:cs="Courier New" w:eastAsia="Courier New" w:hAnsi="Courier New"/>
+                <w:sz w:val="17"/>
+                <w:szCs w:val="17"/>
+              </w:rPr>
+              <w:t xml:space="preserve">CalcForm.TryReadTask</w:t>
+            </w:r>
+          </w:p>
+        </w:tc>
+        <w:tc>
+          <w:tcPr>
+            <w:tcW w:type="dxa" w:w="3000"/>
+            <w:tcBorders>
+              <w:top w:val="single" w:color="000000" w:sz="4"/>
+              <w:left w:val="single" w:color="000000" w:sz="4"/>
+              <w:bottom w:val="single" w:color="000000" w:sz="4"/>
+              <w:right w:val="single" w:color="000000" w:sz="4"/>
+            </w:tcBorders>
+            <w:tcMar>
+              <w:top w:type="dxa" w:w="20"/>
+              <w:left w:type="dxa" w:w="80"/>
+              <w:bottom w:type="dxa" w:w="20"/>
+              <w:right w:type="dxa" w:w="80"/>
+            </w:tcMar>
+            <w:vAlign w:val="center"/>
+          </w:tcPr>
+          <w:p>
+            <w:pPr>
+              <w:spacing w:line="240"/>
+              <w:ind w:firstLine="0"/>
+              <w:jc w:val="left"/>
+            </w:pPr>
+            <w:r>
+              <w:rPr>
+                <w:rFonts w:ascii="Times New Roman" w:cs="Times New Roman" w:eastAsia="Times New Roman" w:hAnsi="Times New Roman"/>
+                <w:sz w:val="22"/>
+                <w:szCs w:val="22"/>
+              </w:rPr>
+              <w:t xml:space="preserve">out IntegrationTask task, out Node node</w:t>
+            </w:r>
+          </w:p>
+        </w:tc>
+        <w:tc>
+          <w:tcPr>
+            <w:tcW w:type="dxa" w:w="1500"/>
+            <w:tcBorders>
+              <w:top w:val="single" w:color="000000" w:sz="4"/>
+              <w:left w:val="single" w:color="000000" w:sz="4"/>
+              <w:bottom w:val="single" w:color="000000" w:sz="4"/>
+              <w:right w:val="single" w:color="000000" w:sz="4"/>
+            </w:tcBorders>
+            <w:tcMar>
+              <w:top w:type="dxa" w:w="20"/>
+              <w:left w:type="dxa" w:w="80"/>
+              <w:bottom w:type="dxa" w:w="20"/>
+              <w:right w:type="dxa" w:w="80"/>
+            </w:tcMar>
+            <w:vAlign w:val="center"/>
+          </w:tcPr>
+          <w:p>
+            <w:pPr>
+              <w:spacing w:line="240"/>
+              <w:ind w:firstLine="0"/>
+              <w:jc w:val="left"/>
+            </w:pPr>
+            <w:r>
+              <w:rPr>
+                <w:rFonts w:ascii="Times New Roman" w:cs="Times New Roman" w:eastAsia="Times New Roman" w:hAnsi="Times New Roman"/>
+                <w:sz w:val="22"/>
+                <w:szCs w:val="22"/>
+              </w:rPr>
+              <w:t xml:space="preserve">bool</w:t>
+            </w:r>
+          </w:p>
+        </w:tc>
+        <w:tc>
+          <w:tcPr>
+            <w:tcW w:type="dxa" w:w="2922"/>
+            <w:tcBorders>
+              <w:top w:val="single" w:color="000000" w:sz="4"/>
+              <w:left w:val="single" w:color="000000" w:sz="4"/>
+              <w:bottom w:val="single" w:color="000000" w:sz="4"/>
+              <w:right w:val="single" w:color="000000" w:sz="4"/>
+            </w:tcBorders>
+            <w:tcMar>
+              <w:top w:type="dxa" w:w="20"/>
+              <w:left w:type="dxa" w:w="80"/>
+              <w:bottom w:type="dxa" w:w="20"/>
+              <w:right w:type="dxa" w:w="80"/>
+            </w:tcMar>
+            <w:vAlign w:val="center"/>
+          </w:tcPr>
+          <w:p>
+            <w:pPr>
+              <w:spacing w:line="240"/>
+              <w:ind w:firstLine="0"/>
+              <w:jc w:val="left"/>
+            </w:pPr>
+            <w:r>
+              <w:rPr>
+                <w:rFonts w:ascii="Times New Roman" w:cs="Times New Roman" w:eastAsia="Times New Roman" w:hAnsi="Times New Roman"/>
+                <w:sz w:val="22"/>
+                <w:szCs w:val="22"/>
+              </w:rPr>
+              <w:t xml:space="preserve">Читает и проверяет поля окна «Расчёт»</w:t>
+            </w:r>
+          </w:p>
+        </w:tc>
+      </w:tr>
+      <w:tr>
+        <w:trPr>
+          <w:cantSplit/>
+        </w:trPr>
+        <w:tc>
+          <w:tcPr>
+            <w:tcW w:type="dxa" w:w="2500"/>
+            <w:tcBorders>
+              <w:top w:val="single" w:color="000000" w:sz="4"/>
+              <w:left w:val="single" w:color="000000" w:sz="4"/>
+              <w:bottom w:val="single" w:color="000000" w:sz="4"/>
+              <w:right w:val="single" w:color="000000" w:sz="4"/>
+            </w:tcBorders>
+            <w:tcMar>
+              <w:top w:type="dxa" w:w="20"/>
+              <w:left w:type="dxa" w:w="80"/>
+              <w:bottom w:type="dxa" w:w="20"/>
+              <w:right w:type="dxa" w:w="80"/>
+            </w:tcMar>
+            <w:vAlign w:val="center"/>
+          </w:tcPr>
+          <w:p>
+            <w:pPr>
+              <w:spacing w:line="240"/>
+              <w:ind w:firstLine="0"/>
+              <w:jc w:val="left"/>
+            </w:pPr>
+            <w:r>
+              <w:rPr>
+                <w:rFonts w:ascii="Courier New" w:cs="Courier New" w:eastAsia="Courier New" w:hAnsi="Courier New"/>
+                <w:sz w:val="17"/>
+                <w:szCs w:val="17"/>
+              </w:rPr>
+              <w:t xml:space="preserve">CalcForm.Calculate</w:t>
+            </w:r>
+          </w:p>
+        </w:tc>
+        <w:tc>
+          <w:tcPr>
+            <w:tcW w:type="dxa" w:w="3000"/>
+            <w:tcBorders>
+              <w:top w:val="single" w:color="000000" w:sz="4"/>
+              <w:left w:val="single" w:color="000000" w:sz="4"/>
+              <w:bottom w:val="single" w:color="000000" w:sz="4"/>
+              <w:right w:val="single" w:color="000000" w:sz="4"/>
+            </w:tcBorders>
+            <w:tcMar>
+              <w:top w:type="dxa" w:w="20"/>
+              <w:left w:type="dxa" w:w="80"/>
+              <w:bottom w:type="dxa" w:w="20"/>
+              <w:right w:type="dxa" w:w="80"/>
+            </w:tcMar>
+            <w:vAlign w:val="center"/>
+          </w:tcPr>
+          <w:p>
+            <w:pPr>
+              <w:spacing w:line="240"/>
+              <w:ind w:firstLine="0"/>
+              <w:jc w:val="left"/>
+            </w:pPr>
+            <w:r>
+              <w:rPr>
+                <w:rFonts w:ascii="Times New Roman" w:cs="Times New Roman" w:eastAsia="Times New Roman" w:hAnsi="Times New Roman"/>
+                <w:sz w:val="22"/>
+                <w:szCs w:val="22"/>
+              </w:rPr>
+              <w:t xml:space="preserve">—</w:t>
+            </w:r>
+          </w:p>
+        </w:tc>
+        <w:tc>
+          <w:tcPr>
+            <w:tcW w:type="dxa" w:w="1500"/>
+            <w:tcBorders>
+              <w:top w:val="single" w:color="000000" w:sz="4"/>
+              <w:left w:val="single" w:color="000000" w:sz="4"/>
+              <w:bottom w:val="single" w:color="000000" w:sz="4"/>
+              <w:right w:val="single" w:color="000000" w:sz="4"/>
+            </w:tcBorders>
+            <w:tcMar>
+              <w:top w:type="dxa" w:w="20"/>
+              <w:left w:type="dxa" w:w="80"/>
+              <w:bottom w:type="dxa" w:w="20"/>
+              <w:right w:type="dxa" w:w="80"/>
+            </w:tcMar>
+            <w:vAlign w:val="center"/>
+          </w:tcPr>
+          <w:p>
+            <w:pPr>
+              <w:spacing w:line="240"/>
+              <w:ind w:firstLine="0"/>
+              <w:jc w:val="left"/>
+            </w:pPr>
+            <w:r>
+              <w:rPr>
+                <w:rFonts w:ascii="Times New Roman" w:cs="Times New Roman" w:eastAsia="Times New Roman" w:hAnsi="Times New Roman"/>
+                <w:sz w:val="22"/>
+                <w:szCs w:val="22"/>
+              </w:rPr>
+              <w:t xml:space="preserve">—</w:t>
+            </w:r>
+          </w:p>
+        </w:tc>
+        <w:tc>
+          <w:tcPr>
+            <w:tcW w:type="dxa" w:w="2922"/>
+            <w:tcBorders>
+              <w:top w:val="single" w:color="000000" w:sz="4"/>
+              <w:left w:val="single" w:color="000000" w:sz="4"/>
+              <w:bottom w:val="single" w:color="000000" w:sz="4"/>
+              <w:right w:val="single" w:color="000000" w:sz="4"/>
+            </w:tcBorders>
+            <w:tcMar>
+              <w:top w:type="dxa" w:w="20"/>
+              <w:left w:type="dxa" w:w="80"/>
+              <w:bottom w:type="dxa" w:w="20"/>
+              <w:right w:type="dxa" w:w="80"/>
+            </w:tcMar>
+            <w:vAlign w:val="center"/>
+          </w:tcPr>
+          <w:p>
+            <w:pPr>
+              <w:spacing w:line="240"/>
+              <w:ind w:firstLine="0"/>
+              <w:jc w:val="left"/>
+            </w:pPr>
+            <w:r>
+              <w:rPr>
+                <w:rFonts w:ascii="Times New Roman" w:cs="Times New Roman" w:eastAsia="Times New Roman" w:hAnsi="Times New Roman"/>
+                <w:sz w:val="22"/>
+                <w:szCs w:val="22"/>
+              </w:rPr>
+              <w:t xml:space="preserve">Выполняет расчёт выбранным методом (или обоими) и выводит результаты</w:t>
+            </w:r>
+          </w:p>
+        </w:tc>
+      </w:tr>
+      <w:tr>
+        <w:trPr>
+          <w:cantSplit/>
+        </w:trPr>
+        <w:tc>
+          <w:tcPr>
+            <w:tcW w:type="dxa" w:w="2500"/>
+            <w:tcBorders>
+              <w:top w:val="single" w:color="000000" w:sz="4"/>
+              <w:left w:val="single" w:color="000000" w:sz="4"/>
+              <w:bottom w:val="single" w:color="000000" w:sz="4"/>
+              <w:right w:val="single" w:color="000000" w:sz="4"/>
+            </w:tcBorders>
+            <w:tcMar>
+              <w:top w:type="dxa" w:w="20"/>
+              <w:left w:type="dxa" w:w="80"/>
+              <w:bottom w:type="dxa" w:w="20"/>
+              <w:right w:type="dxa" w:w="80"/>
+            </w:tcMar>
+            <w:vAlign w:val="center"/>
+          </w:tcPr>
+          <w:p>
+            <w:pPr>
+              <w:spacing w:line="240"/>
+              <w:ind w:firstLine="0"/>
+              <w:jc w:val="left"/>
+            </w:pPr>
+            <w:r>
+              <w:rPr>
+                <w:rFonts w:ascii="Courier New" w:cs="Courier New" w:eastAsia="Courier New" w:hAnsi="Courier New"/>
+                <w:sz w:val="17"/>
+                <w:szCs w:val="17"/>
+              </w:rPr>
+              <w:t xml:space="preserve">CalcForm.LoadTask</w:t>
+            </w:r>
+          </w:p>
+        </w:tc>
+        <w:tc>
+          <w:tcPr>
+            <w:tcW w:type="dxa" w:w="3000"/>
+            <w:tcBorders>
+              <w:top w:val="single" w:color="000000" w:sz="4"/>
+              <w:left w:val="single" w:color="000000" w:sz="4"/>
+              <w:bottom w:val="single" w:color="000000" w:sz="4"/>
+              <w:right w:val="single" w:color="000000" w:sz="4"/>
+            </w:tcBorders>
+            <w:tcMar>
+              <w:top w:type="dxa" w:w="20"/>
+              <w:left w:type="dxa" w:w="80"/>
+              <w:bottom w:type="dxa" w:w="20"/>
+              <w:right w:type="dxa" w:w="80"/>
+            </w:tcMar>
+            <w:vAlign w:val="center"/>
+          </w:tcPr>
+          <w:p>
+            <w:pPr>
+              <w:spacing w:line="240"/>
+              <w:ind w:firstLine="0"/>
+              <w:jc w:val="left"/>
+            </w:pPr>
+            <w:r>
+              <w:rPr>
+                <w:rFonts w:ascii="Times New Roman" w:cs="Times New Roman" w:eastAsia="Times New Roman" w:hAnsi="Times New Roman"/>
+                <w:sz w:val="22"/>
+                <w:szCs w:val="22"/>
+              </w:rPr>
+              <w:t xml:space="preserve">IntegrationTask t</w:t>
+            </w:r>
+          </w:p>
+        </w:tc>
+        <w:tc>
+          <w:tcPr>
+            <w:tcW w:type="dxa" w:w="1500"/>
+            <w:tcBorders>
+              <w:top w:val="single" w:color="000000" w:sz="4"/>
+              <w:left w:val="single" w:color="000000" w:sz="4"/>
+              <w:bottom w:val="single" w:color="000000" w:sz="4"/>
+              <w:right w:val="single" w:color="000000" w:sz="4"/>
+            </w:tcBorders>
+            <w:tcMar>
+              <w:top w:type="dxa" w:w="20"/>
+              <w:left w:type="dxa" w:w="80"/>
+              <w:bottom w:type="dxa" w:w="20"/>
+              <w:right w:type="dxa" w:w="80"/>
+            </w:tcMar>
+            <w:vAlign w:val="center"/>
+          </w:tcPr>
+          <w:p>
+            <w:pPr>
+              <w:spacing w:line="240"/>
+              <w:ind w:firstLine="0"/>
+              <w:jc w:val="left"/>
+            </w:pPr>
+            <w:r>
+              <w:rPr>
+                <w:rFonts w:ascii="Times New Roman" w:cs="Times New Roman" w:eastAsia="Times New Roman" w:hAnsi="Times New Roman"/>
+                <w:sz w:val="22"/>
+                <w:szCs w:val="22"/>
+              </w:rPr>
+              <w:t xml:space="preserve">—</w:t>
+            </w:r>
+          </w:p>
+        </w:tc>
+        <w:tc>
+          <w:tcPr>
+            <w:tcW w:type="dxa" w:w="2922"/>
+            <w:tcBorders>
+              <w:top w:val="single" w:color="000000" w:sz="4"/>
+              <w:left w:val="single" w:color="000000" w:sz="4"/>
+              <w:bottom w:val="single" w:color="000000" w:sz="4"/>
+              <w:right w:val="single" w:color="000000" w:sz="4"/>
+            </w:tcBorders>
+            <w:tcMar>
+              <w:top w:type="dxa" w:w="20"/>
+              <w:left w:type="dxa" w:w="80"/>
+              <w:bottom w:type="dxa" w:w="20"/>
+              <w:right w:type="dxa" w:w="80"/>
+            </w:tcMar>
+            <w:vAlign w:val="center"/>
+          </w:tcPr>
+          <w:p>
+            <w:pPr>
+              <w:spacing w:line="240"/>
+              <w:ind w:firstLine="0"/>
+              <w:jc w:val="left"/>
+            </w:pPr>
+            <w:r>
+              <w:rPr>
+                <w:rFonts w:ascii="Times New Roman" w:cs="Times New Roman" w:eastAsia="Times New Roman" w:hAnsi="Times New Roman"/>
+                <w:sz w:val="22"/>
+                <w:szCs w:val="22"/>
+              </w:rPr>
+              <w:t xml:space="preserve">Заполняет поля ввода из файла исходных данных</w:t>
+            </w:r>
+          </w:p>
+        </w:tc>
+      </w:tr>
+      <w:tr>
+        <w:trPr>
+          <w:cantSplit/>
+        </w:trPr>
+        <w:tc>
+          <w:tcPr>
+            <w:tcW w:type="dxa" w:w="2500"/>
+            <w:tcBorders>
+              <w:top w:val="single" w:color="000000" w:sz="4"/>
+              <w:left w:val="single" w:color="000000" w:sz="4"/>
+              <w:bottom w:val="single" w:color="000000" w:sz="4"/>
+              <w:right w:val="single" w:color="000000" w:sz="4"/>
+            </w:tcBorders>
+            <w:tcMar>
+              <w:top w:type="dxa" w:w="20"/>
+              <w:left w:type="dxa" w:w="80"/>
+              <w:bottom w:type="dxa" w:w="20"/>
+              <w:right w:type="dxa" w:w="80"/>
+            </w:tcMar>
+            <w:vAlign w:val="center"/>
+          </w:tcPr>
+          <w:p>
+            <w:pPr>
+              <w:spacing w:line="240"/>
+              <w:ind w:firstLine="0"/>
+              <w:jc w:val="left"/>
+            </w:pPr>
+            <w:r>
+              <w:rPr>
+                <w:rFonts w:ascii="Courier New" w:cs="Courier New" w:eastAsia="Courier New" w:hAnsi="Courier New"/>
+                <w:sz w:val="17"/>
+                <w:szCs w:val="17"/>
+              </w:rPr>
+              <w:t xml:space="preserve">CalcForm.ShowResults</w:t>
+            </w:r>
+          </w:p>
+        </w:tc>
+        <w:tc>
+          <w:tcPr>
+            <w:tcW w:type="dxa" w:w="3000"/>
+            <w:tcBorders>
+              <w:top w:val="single" w:color="000000" w:sz="4"/>
+              <w:left w:val="single" w:color="000000" w:sz="4"/>
+              <w:bottom w:val="single" w:color="000000" w:sz="4"/>
+              <w:right w:val="single" w:color="000000" w:sz="4"/>
+            </w:tcBorders>
+            <w:tcMar>
+              <w:top w:type="dxa" w:w="20"/>
+              <w:left w:type="dxa" w:w="80"/>
+              <w:bottom w:type="dxa" w:w="20"/>
+              <w:right w:type="dxa" w:w="80"/>
+            </w:tcMar>
+            <w:vAlign w:val="center"/>
+          </w:tcPr>
+          <w:p>
+            <w:pPr>
+              <w:spacing w:line="240"/>
+              <w:ind w:firstLine="0"/>
+              <w:jc w:val="left"/>
+            </w:pPr>
+            <w:r>
+              <w:rPr>
+                <w:rFonts w:ascii="Times New Roman" w:cs="Times New Roman" w:eastAsia="Times New Roman" w:hAnsi="Times New Roman"/>
+                <w:sz w:val="22"/>
+                <w:szCs w:val="22"/>
+              </w:rPr>
+              <w:t xml:space="preserve">—</w:t>
+            </w:r>
+          </w:p>
+        </w:tc>
+        <w:tc>
+          <w:tcPr>
+            <w:tcW w:type="dxa" w:w="1500"/>
+            <w:tcBorders>
+              <w:top w:val="single" w:color="000000" w:sz="4"/>
+              <w:left w:val="single" w:color="000000" w:sz="4"/>
+              <w:bottom w:val="single" w:color="000000" w:sz="4"/>
+              <w:right w:val="single" w:color="000000" w:sz="4"/>
+            </w:tcBorders>
+            <w:tcMar>
+              <w:top w:type="dxa" w:w="20"/>
+              <w:left w:type="dxa" w:w="80"/>
+              <w:bottom w:type="dxa" w:w="20"/>
+              <w:right w:type="dxa" w:w="80"/>
+            </w:tcMar>
+            <w:vAlign w:val="center"/>
+          </w:tcPr>
+          <w:p>
+            <w:pPr>
+              <w:spacing w:line="240"/>
+              <w:ind w:firstLine="0"/>
+              <w:jc w:val="left"/>
+            </w:pPr>
+            <w:r>
+              <w:rPr>
+                <w:rFonts w:ascii="Times New Roman" w:cs="Times New Roman" w:eastAsia="Times New Roman" w:hAnsi="Times New Roman"/>
+                <w:sz w:val="22"/>
+                <w:szCs w:val="22"/>
+              </w:rPr>
+              <w:t xml:space="preserve">—</w:t>
+            </w:r>
+          </w:p>
+        </w:tc>
+        <w:tc>
+          <w:tcPr>
+            <w:tcW w:type="dxa" w:w="2922"/>
+            <w:tcBorders>
+              <w:top w:val="single" w:color="000000" w:sz="4"/>
+              <w:left w:val="single" w:color="000000" w:sz="4"/>
+              <w:bottom w:val="single" w:color="000000" w:sz="4"/>
+              <w:right w:val="single" w:color="000000" w:sz="4"/>
+            </w:tcBorders>
+            <w:tcMar>
+              <w:top w:type="dxa" w:w="20"/>
+              <w:left w:type="dxa" w:w="80"/>
+              <w:bottom w:type="dxa" w:w="20"/>
+              <w:right w:type="dxa" w:w="80"/>
+            </w:tcMar>
+            <w:vAlign w:val="center"/>
+          </w:tcPr>
+          <w:p>
+            <w:pPr>
+              <w:spacing w:line="240"/>
+              <w:ind w:firstLine="0"/>
+              <w:jc w:val="left"/>
+            </w:pPr>
+            <w:r>
+              <w:rPr>
+                <w:rFonts w:ascii="Times New Roman" w:cs="Times New Roman" w:eastAsia="Times New Roman" w:hAnsi="Times New Roman"/>
+                <w:sz w:val="22"/>
+                <w:szCs w:val="22"/>
+              </w:rPr>
+              <w:t xml:space="preserve">Выводит сводную таблицу и предупреждения</w:t>
+            </w:r>
+          </w:p>
+        </w:tc>
+      </w:tr>
+      <w:tr>
+        <w:trPr>
+          <w:cantSplit/>
+        </w:trPr>
+        <w:tc>
+          <w:tcPr>
+            <w:tcW w:type="dxa" w:w="2500"/>
+            <w:tcBorders>
+              <w:top w:val="single" w:color="000000" w:sz="4"/>
+              <w:left w:val="single" w:color="000000" w:sz="4"/>
+              <w:bottom w:val="single" w:color="000000" w:sz="4"/>
+              <w:right w:val="single" w:color="000000" w:sz="4"/>
+            </w:tcBorders>
+            <w:tcMar>
+              <w:top w:type="dxa" w:w="20"/>
+              <w:left w:type="dxa" w:w="80"/>
+              <w:bottom w:type="dxa" w:w="20"/>
+              <w:right w:type="dxa" w:w="80"/>
+            </w:tcMar>
+            <w:vAlign w:val="center"/>
+          </w:tcPr>
+          <w:p>
+            <w:pPr>
+              <w:spacing w:line="240"/>
+              <w:ind w:firstLine="0"/>
+              <w:jc w:val="left"/>
+            </w:pPr>
+            <w:r>
+              <w:rPr>
+                <w:rFonts w:ascii="Courier New" w:cs="Courier New" w:eastAsia="Courier New" w:hAnsi="Courier New"/>
+                <w:sz w:val="17"/>
+                <w:szCs w:val="17"/>
+              </w:rPr>
+              <w:t xml:space="preserve">CalcForm.ShowSteps</w:t>
+            </w:r>
+          </w:p>
+        </w:tc>
+        <w:tc>
+          <w:tcPr>
+            <w:tcW w:type="dxa" w:w="3000"/>
+            <w:tcBorders>
+              <w:top w:val="single" w:color="000000" w:sz="4"/>
+              <w:left w:val="single" w:color="000000" w:sz="4"/>
+              <w:bottom w:val="single" w:color="000000" w:sz="4"/>
+              <w:right w:val="single" w:color="000000" w:sz="4"/>
+            </w:tcBorders>
+            <w:tcMar>
+              <w:top w:type="dxa" w:w="20"/>
+              <w:left w:type="dxa" w:w="80"/>
+              <w:bottom w:type="dxa" w:w="20"/>
+              <w:right w:type="dxa" w:w="80"/>
+            </w:tcMar>
+            <w:vAlign w:val="center"/>
+          </w:tcPr>
+          <w:p>
+            <w:pPr>
+              <w:spacing w:line="240"/>
+              <w:ind w:firstLine="0"/>
+              <w:jc w:val="left"/>
+            </w:pPr>
+            <w:r>
+              <w:rPr>
+                <w:rFonts w:ascii="Times New Roman" w:cs="Times New Roman" w:eastAsia="Times New Roman" w:hAnsi="Times New Roman"/>
+                <w:sz w:val="22"/>
+                <w:szCs w:val="22"/>
+              </w:rPr>
+              <w:t xml:space="preserve">—</w:t>
+            </w:r>
+          </w:p>
+        </w:tc>
+        <w:tc>
+          <w:tcPr>
+            <w:tcW w:type="dxa" w:w="1500"/>
+            <w:tcBorders>
+              <w:top w:val="single" w:color="000000" w:sz="4"/>
+              <w:left w:val="single" w:color="000000" w:sz="4"/>
+              <w:bottom w:val="single" w:color="000000" w:sz="4"/>
+              <w:right w:val="single" w:color="000000" w:sz="4"/>
+            </w:tcBorders>
+            <w:tcMar>
+              <w:top w:type="dxa" w:w="20"/>
+              <w:left w:type="dxa" w:w="80"/>
+              <w:bottom w:type="dxa" w:w="20"/>
+              <w:right w:type="dxa" w:w="80"/>
+            </w:tcMar>
+            <w:vAlign w:val="center"/>
+          </w:tcPr>
+          <w:p>
+            <w:pPr>
+              <w:spacing w:line="240"/>
+              <w:ind w:firstLine="0"/>
+              <w:jc w:val="left"/>
+            </w:pPr>
+            <w:r>
+              <w:rPr>
+                <w:rFonts w:ascii="Times New Roman" w:cs="Times New Roman" w:eastAsia="Times New Roman" w:hAnsi="Times New Roman"/>
+                <w:sz w:val="22"/>
+                <w:szCs w:val="22"/>
+              </w:rPr>
+              <w:t xml:space="preserve">—</w:t>
+            </w:r>
+          </w:p>
+        </w:tc>
+        <w:tc>
+          <w:tcPr>
+            <w:tcW w:type="dxa" w:w="2922"/>
+            <w:tcBorders>
+              <w:top w:val="single" w:color="000000" w:sz="4"/>
+              <w:left w:val="single" w:color="000000" w:sz="4"/>
+              <w:bottom w:val="single" w:color="000000" w:sz="4"/>
+              <w:right w:val="single" w:color="000000" w:sz="4"/>
+            </w:tcBorders>
+            <w:tcMar>
+              <w:top w:type="dxa" w:w="20"/>
+              <w:left w:type="dxa" w:w="80"/>
+              <w:bottom w:type="dxa" w:w="20"/>
+              <w:right w:type="dxa" w:w="80"/>
+            </w:tcMar>
+            <w:vAlign w:val="center"/>
+          </w:tcPr>
+          <w:p>
+            <w:pPr>
+              <w:spacing w:line="240"/>
+              <w:ind w:firstLine="0"/>
+              <w:jc w:val="left"/>
+            </w:pPr>
+            <w:r>
+              <w:rPr>
+                <w:rFonts w:ascii="Times New Roman" w:cs="Times New Roman" w:eastAsia="Times New Roman" w:hAnsi="Times New Roman"/>
+                <w:sz w:val="22"/>
+                <w:szCs w:val="22"/>
+              </w:rPr>
+              <w:t xml:space="preserve">Выводит таблицу сходимости выбранного метода</w:t>
+            </w:r>
+          </w:p>
+        </w:tc>
+      </w:tr>
+      <w:tr>
+        <w:trPr>
+          <w:cantSplit/>
+        </w:trPr>
+        <w:tc>
+          <w:tcPr>
+            <w:tcW w:type="dxa" w:w="2500"/>
+            <w:tcBorders>
+              <w:top w:val="single" w:color="000000" w:sz="4"/>
+              <w:left w:val="single" w:color="000000" w:sz="4"/>
+              <w:bottom w:val="single" w:color="000000" w:sz="4"/>
+              <w:right w:val="single" w:color="000000" w:sz="4"/>
+            </w:tcBorders>
+            <w:tcMar>
+              <w:top w:type="dxa" w:w="20"/>
+              <w:left w:type="dxa" w:w="80"/>
+              <w:bottom w:type="dxa" w:w="20"/>
+              <w:right w:type="dxa" w:w="80"/>
+            </w:tcMar>
+            <w:vAlign w:val="center"/>
+          </w:tcPr>
+          <w:p>
+            <w:pPr>
+              <w:spacing w:line="240"/>
+              <w:ind w:firstLine="0"/>
+              <w:jc w:val="left"/>
+            </w:pPr>
+            <w:r>
+              <w:rPr>
+                <w:rFonts w:ascii="Courier New" w:cs="Courier New" w:eastAsia="Courier New" w:hAnsi="Courier New"/>
+                <w:sz w:val="17"/>
+                <w:szCs w:val="17"/>
+              </w:rPr>
+              <w:t xml:space="preserve">PlotPanel.OnPaint</w:t>
+            </w:r>
+          </w:p>
+        </w:tc>
+        <w:tc>
+          <w:tcPr>
+            <w:tcW w:type="dxa" w:w="3000"/>
+            <w:tcBorders>
+              <w:top w:val="single" w:color="000000" w:sz="4"/>
+              <w:left w:val="single" w:color="000000" w:sz="4"/>
+              <w:bottom w:val="single" w:color="000000" w:sz="4"/>
+              <w:right w:val="single" w:color="000000" w:sz="4"/>
+            </w:tcBorders>
+            <w:tcMar>
+              <w:top w:type="dxa" w:w="20"/>
+              <w:left w:type="dxa" w:w="80"/>
+              <w:bottom w:type="dxa" w:w="20"/>
+              <w:right w:type="dxa" w:w="80"/>
+            </w:tcMar>
+            <w:vAlign w:val="center"/>
+          </w:tcPr>
+          <w:p>
+            <w:pPr>
+              <w:spacing w:line="240"/>
+              <w:ind w:firstLine="0"/>
+              <w:jc w:val="left"/>
+            </w:pPr>
+            <w:r>
+              <w:rPr>
+                <w:rFonts w:ascii="Times New Roman" w:cs="Times New Roman" w:eastAsia="Times New Roman" w:hAnsi="Times New Roman"/>
+                <w:sz w:val="22"/>
+                <w:szCs w:val="22"/>
+              </w:rPr>
+              <w:t xml:space="preserve">PaintEventArgs e</w:t>
+            </w:r>
+          </w:p>
+        </w:tc>
+        <w:tc>
+          <w:tcPr>
+            <w:tcW w:type="dxa" w:w="1500"/>
+            <w:tcBorders>
+              <w:top w:val="single" w:color="000000" w:sz="4"/>
+              <w:left w:val="single" w:color="000000" w:sz="4"/>
+              <w:bottom w:val="single" w:color="000000" w:sz="4"/>
+              <w:right w:val="single" w:color="000000" w:sz="4"/>
+            </w:tcBorders>
+            <w:tcMar>
+              <w:top w:type="dxa" w:w="20"/>
+              <w:left w:type="dxa" w:w="80"/>
+              <w:bottom w:type="dxa" w:w="20"/>
+              <w:right w:type="dxa" w:w="80"/>
+            </w:tcMar>
+            <w:vAlign w:val="center"/>
+          </w:tcPr>
+          <w:p>
+            <w:pPr>
+              <w:spacing w:line="240"/>
+              <w:ind w:firstLine="0"/>
+              <w:jc w:val="left"/>
+            </w:pPr>
+            <w:r>
+              <w:rPr>
+                <w:rFonts w:ascii="Times New Roman" w:cs="Times New Roman" w:eastAsia="Times New Roman" w:hAnsi="Times New Roman"/>
+                <w:sz w:val="22"/>
+                <w:szCs w:val="22"/>
+              </w:rPr>
+              <w:t xml:space="preserve">—</w:t>
+            </w:r>
+          </w:p>
+        </w:tc>
+        <w:tc>
+          <w:tcPr>
+            <w:tcW w:type="dxa" w:w="2922"/>
+            <w:tcBorders>
+              <w:top w:val="single" w:color="000000" w:sz="4"/>
+              <w:left w:val="single" w:color="000000" w:sz="4"/>
+              <w:bottom w:val="single" w:color="000000" w:sz="4"/>
+              <w:right w:val="single" w:color="000000" w:sz="4"/>
+            </w:tcBorders>
+            <w:tcMar>
+              <w:top w:type="dxa" w:w="20"/>
+              <w:left w:type="dxa" w:w="80"/>
+              <w:bottom w:type="dxa" w:w="20"/>
+              <w:right w:type="dxa" w:w="80"/>
+            </w:tcMar>
+            <w:vAlign w:val="center"/>
+          </w:tcPr>
+          <w:p>
+            <w:pPr>
+              <w:spacing w:line="240"/>
+              <w:ind w:firstLine="0"/>
+              <w:jc w:val="left"/>
+            </w:pPr>
+            <w:r>
+              <w:rPr>
+                <w:rFonts w:ascii="Times New Roman" w:cs="Times New Roman" w:eastAsia="Times New Roman" w:hAnsi="Times New Roman"/>
+                <w:sz w:val="22"/>
+                <w:szCs w:val="22"/>
+              </w:rPr>
+              <w:t xml:space="preserve">Рисует график: сетку, площадь, узлы, кривую</w:t>
+            </w:r>
+          </w:p>
+        </w:tc>
+      </w:tr>
+      <w:tr>
+        <w:trPr>
+          <w:cantSplit/>
+        </w:trPr>
+        <w:tc>
+          <w:tcPr>
+            <w:tcW w:type="dxa" w:w="2500"/>
+            <w:tcBorders>
+              <w:top w:val="single" w:color="000000" w:sz="4"/>
+              <w:left w:val="single" w:color="000000" w:sz="4"/>
+              <w:bottom w:val="single" w:color="000000" w:sz="4"/>
+              <w:right w:val="single" w:color="000000" w:sz="4"/>
+            </w:tcBorders>
+            <w:tcMar>
+              <w:top w:type="dxa" w:w="20"/>
+              <w:left w:type="dxa" w:w="80"/>
+              <w:bottom w:type="dxa" w:w="20"/>
+              <w:right w:type="dxa" w:w="80"/>
+            </w:tcMar>
+            <w:vAlign w:val="center"/>
+          </w:tcPr>
+          <w:p>
+            <w:pPr>
+              <w:spacing w:line="240"/>
+              <w:ind w:firstLine="0"/>
+              <w:jc w:val="left"/>
+            </w:pPr>
+            <w:r>
+              <w:rPr>
+                <w:rFonts w:ascii="Courier New" w:cs="Courier New" w:eastAsia="Courier New" w:hAnsi="Courier New"/>
+                <w:sz w:val="17"/>
+                <w:szCs w:val="17"/>
+              </w:rPr>
+              <w:t xml:space="preserve">PlotPanel.DrawGrid</w:t>
+            </w:r>
+          </w:p>
+        </w:tc>
+        <w:tc>
+          <w:tcPr>
+            <w:tcW w:type="dxa" w:w="3000"/>
+            <w:tcBorders>
+              <w:top w:val="single" w:color="000000" w:sz="4"/>
+              <w:left w:val="single" w:color="000000" w:sz="4"/>
+              <w:bottom w:val="single" w:color="000000" w:sz="4"/>
+              <w:right w:val="single" w:color="000000" w:sz="4"/>
+            </w:tcBorders>
+            <w:tcMar>
+              <w:top w:type="dxa" w:w="20"/>
+              <w:left w:type="dxa" w:w="80"/>
+              <w:bottom w:type="dxa" w:w="20"/>
+              <w:right w:type="dxa" w:w="80"/>
+            </w:tcMar>
+            <w:vAlign w:val="center"/>
+          </w:tcPr>
+          <w:p>
+            <w:pPr>
+              <w:spacing w:line="240"/>
+              <w:ind w:firstLine="0"/>
+              <w:jc w:val="left"/>
+            </w:pPr>
+            <w:r>
+              <w:rPr>
+                <w:rFonts w:ascii="Times New Roman" w:cs="Times New Roman" w:eastAsia="Times New Roman" w:hAnsi="Times New Roman"/>
+                <w:sz w:val="22"/>
+                <w:szCs w:val="22"/>
+              </w:rPr>
+              <w:t xml:space="preserve">Graphics g, Rectangle plot, ...</w:t>
+            </w:r>
+          </w:p>
+        </w:tc>
+        <w:tc>
+          <w:tcPr>
+            <w:tcW w:type="dxa" w:w="1500"/>
+            <w:tcBorders>
+              <w:top w:val="single" w:color="000000" w:sz="4"/>
+              <w:left w:val="single" w:color="000000" w:sz="4"/>
+              <w:bottom w:val="single" w:color="000000" w:sz="4"/>
+              <w:right w:val="single" w:color="000000" w:sz="4"/>
+            </w:tcBorders>
+            <w:tcMar>
+              <w:top w:type="dxa" w:w="20"/>
+              <w:left w:type="dxa" w:w="80"/>
+              <w:bottom w:type="dxa" w:w="20"/>
+              <w:right w:type="dxa" w:w="80"/>
+            </w:tcMar>
+            <w:vAlign w:val="center"/>
+          </w:tcPr>
+          <w:p>
+            <w:pPr>
+              <w:spacing w:line="240"/>
+              <w:ind w:firstLine="0"/>
+              <w:jc w:val="left"/>
+            </w:pPr>
+            <w:r>
+              <w:rPr>
+                <w:rFonts w:ascii="Times New Roman" w:cs="Times New Roman" w:eastAsia="Times New Roman" w:hAnsi="Times New Roman"/>
+                <w:sz w:val="22"/>
+                <w:szCs w:val="22"/>
+              </w:rPr>
+              <w:t xml:space="preserve">—</w:t>
+            </w:r>
+          </w:p>
+        </w:tc>
+        <w:tc>
+          <w:tcPr>
+            <w:tcW w:type="dxa" w:w="2922"/>
+            <w:tcBorders>
+              <w:top w:val="single" w:color="000000" w:sz="4"/>
+              <w:left w:val="single" w:color="000000" w:sz="4"/>
+              <w:bottom w:val="single" w:color="000000" w:sz="4"/>
+              <w:right w:val="single" w:color="000000" w:sz="4"/>
+            </w:tcBorders>
+            <w:tcMar>
+              <w:top w:type="dxa" w:w="20"/>
+              <w:left w:type="dxa" w:w="80"/>
+              <w:bottom w:type="dxa" w:w="20"/>
+              <w:right w:type="dxa" w:w="80"/>
+            </w:tcMar>
+            <w:vAlign w:val="center"/>
+          </w:tcPr>
+          <w:p>
+            <w:pPr>
+              <w:spacing w:line="240"/>
+              <w:ind w:firstLine="0"/>
+              <w:jc w:val="left"/>
+            </w:pPr>
+            <w:r>
+              <w:rPr>
+                <w:rFonts w:ascii="Times New Roman" w:cs="Times New Roman" w:eastAsia="Times New Roman" w:hAnsi="Times New Roman"/>
+                <w:sz w:val="22"/>
+                <w:szCs w:val="22"/>
+              </w:rPr>
+              <w:t xml:space="preserve">Рисует сетку и подписи осей</w:t>
+            </w:r>
+          </w:p>
+        </w:tc>
+      </w:tr>
+      <w:tr>
+        <w:trPr>
+          <w:cantSplit/>
+        </w:trPr>
+        <w:tc>
+          <w:tcPr>
+            <w:tcW w:type="dxa" w:w="2500"/>
+            <w:tcBorders>
+              <w:top w:val="single" w:color="000000" w:sz="4"/>
+              <w:left w:val="single" w:color="000000" w:sz="4"/>
+              <w:bottom w:val="single" w:color="000000" w:sz="4"/>
+              <w:right w:val="single" w:color="000000" w:sz="4"/>
+            </w:tcBorders>
+            <w:tcMar>
+              <w:top w:type="dxa" w:w="20"/>
+              <w:left w:type="dxa" w:w="80"/>
+              <w:bottom w:type="dxa" w:w="20"/>
+              <w:right w:type="dxa" w:w="80"/>
+            </w:tcMar>
+            <w:vAlign w:val="center"/>
+          </w:tcPr>
+          <w:p>
+            <w:pPr>
+              <w:spacing w:line="240"/>
+              <w:ind w:firstLine="0"/>
+              <w:jc w:val="left"/>
+            </w:pPr>
+            <w:r>
+              <w:rPr>
+                <w:rFonts w:ascii="Courier New" w:cs="Courier New" w:eastAsia="Courier New" w:hAnsi="Courier New"/>
+                <w:sz w:val="17"/>
+                <w:szCs w:val="17"/>
+              </w:rPr>
+              <w:t xml:space="preserve">MainForm.NewCalc</w:t>
+            </w:r>
+          </w:p>
+        </w:tc>
+        <w:tc>
+          <w:tcPr>
+            <w:tcW w:type="dxa" w:w="3000"/>
+            <w:tcBorders>
+              <w:top w:val="single" w:color="000000" w:sz="4"/>
+              <w:left w:val="single" w:color="000000" w:sz="4"/>
+              <w:bottom w:val="single" w:color="000000" w:sz="4"/>
+              <w:right w:val="single" w:color="000000" w:sz="4"/>
+            </w:tcBorders>
+            <w:tcMar>
+              <w:top w:type="dxa" w:w="20"/>
+              <w:left w:type="dxa" w:w="80"/>
+              <w:bottom w:type="dxa" w:w="20"/>
+              <w:right w:type="dxa" w:w="80"/>
+            </w:tcMar>
+            <w:vAlign w:val="center"/>
+          </w:tcPr>
+          <w:p>
+            <w:pPr>
+              <w:spacing w:line="240"/>
+              <w:ind w:firstLine="0"/>
+              <w:jc w:val="left"/>
+            </w:pPr>
+            <w:r>
+              <w:rPr>
+                <w:rFonts w:ascii="Times New Roman" w:cs="Times New Roman" w:eastAsia="Times New Roman" w:hAnsi="Times New Roman"/>
+                <w:sz w:val="22"/>
+                <w:szCs w:val="22"/>
+              </w:rPr>
+              <w:t xml:space="preserve">IntegrationTask task, string title</w:t>
+            </w:r>
+          </w:p>
+        </w:tc>
+        <w:tc>
+          <w:tcPr>
+            <w:tcW w:type="dxa" w:w="1500"/>
+            <w:tcBorders>
+              <w:top w:val="single" w:color="000000" w:sz="4"/>
+              <w:left w:val="single" w:color="000000" w:sz="4"/>
+              <w:bottom w:val="single" w:color="000000" w:sz="4"/>
+              <w:right w:val="single" w:color="000000" w:sz="4"/>
+            </w:tcBorders>
+            <w:tcMar>
+              <w:top w:type="dxa" w:w="20"/>
+              <w:left w:type="dxa" w:w="80"/>
+              <w:bottom w:type="dxa" w:w="20"/>
+              <w:right w:type="dxa" w:w="80"/>
+            </w:tcMar>
+            <w:vAlign w:val="center"/>
+          </w:tcPr>
+          <w:p>
+            <w:pPr>
+              <w:spacing w:line="240"/>
+              <w:ind w:firstLine="0"/>
+              <w:jc w:val="left"/>
+            </w:pPr>
+            <w:r>
+              <w:rPr>
+                <w:rFonts w:ascii="Times New Roman" w:cs="Times New Roman" w:eastAsia="Times New Roman" w:hAnsi="Times New Roman"/>
+                <w:sz w:val="22"/>
+                <w:szCs w:val="22"/>
+              </w:rPr>
+              <w:t xml:space="preserve">CalcForm</w:t>
+            </w:r>
+          </w:p>
+        </w:tc>
+        <w:tc>
+          <w:tcPr>
+            <w:tcW w:type="dxa" w:w="2922"/>
+            <w:tcBorders>
+              <w:top w:val="single" w:color="000000" w:sz="4"/>
+              <w:left w:val="single" w:color="000000" w:sz="4"/>
+              <w:bottom w:val="single" w:color="000000" w:sz="4"/>
+              <w:right w:val="single" w:color="000000" w:sz="4"/>
+            </w:tcBorders>
+            <w:tcMar>
+              <w:top w:type="dxa" w:w="20"/>
+              <w:left w:type="dxa" w:w="80"/>
+              <w:bottom w:type="dxa" w:w="20"/>
+              <w:right w:type="dxa" w:w="80"/>
+            </w:tcMar>
+            <w:vAlign w:val="center"/>
+          </w:tcPr>
+          <w:p>
+            <w:pPr>
+              <w:spacing w:line="240"/>
+              <w:ind w:firstLine="0"/>
+              <w:jc w:val="left"/>
+            </w:pPr>
+            <w:r>
+              <w:rPr>
+                <w:rFonts w:ascii="Times New Roman" w:cs="Times New Roman" w:eastAsia="Times New Roman" w:hAnsi="Times New Roman"/>
+                <w:sz w:val="22"/>
+                <w:szCs w:val="22"/>
+              </w:rPr>
+              <w:t xml:space="preserve">Открывает новое окно расчёта</w:t>
+            </w:r>
+          </w:p>
+        </w:tc>
+      </w:tr>
+      <w:tr>
+        <w:trPr>
+          <w:cantSplit/>
+        </w:trPr>
+        <w:tc>
+          <w:tcPr>
+            <w:tcW w:type="dxa" w:w="2500"/>
+            <w:tcBorders>
+              <w:top w:val="single" w:color="000000" w:sz="4"/>
+              <w:left w:val="single" w:color="000000" w:sz="4"/>
+              <w:bottom w:val="single" w:color="000000" w:sz="4"/>
+              <w:right w:val="single" w:color="000000" w:sz="4"/>
+            </w:tcBorders>
+            <w:tcMar>
+              <w:top w:type="dxa" w:w="20"/>
+              <w:left w:type="dxa" w:w="80"/>
+              <w:bottom w:type="dxa" w:w="20"/>
+              <w:right w:type="dxa" w:w="80"/>
+            </w:tcMar>
+            <w:vAlign w:val="center"/>
+          </w:tcPr>
+          <w:p>
+            <w:pPr>
+              <w:spacing w:line="240"/>
+              <w:ind w:firstLine="0"/>
+              <w:jc w:val="left"/>
+            </w:pPr>
+            <w:r>
+              <w:rPr>
+                <w:rFonts w:ascii="Courier New" w:cs="Courier New" w:eastAsia="Courier New" w:hAnsi="Courier New"/>
+                <w:sz w:val="17"/>
+                <w:szCs w:val="17"/>
+              </w:rPr>
+              <w:t xml:space="preserve">MainForm.OpenData</w:t>
+            </w:r>
+          </w:p>
+        </w:tc>
+        <w:tc>
+          <w:tcPr>
+            <w:tcW w:type="dxa" w:w="3000"/>
+            <w:tcBorders>
+              <w:top w:val="single" w:color="000000" w:sz="4"/>
+              <w:left w:val="single" w:color="000000" w:sz="4"/>
+              <w:bottom w:val="single" w:color="000000" w:sz="4"/>
+              <w:right w:val="single" w:color="000000" w:sz="4"/>
+            </w:tcBorders>
+            <w:tcMar>
+              <w:top w:type="dxa" w:w="20"/>
+              <w:left w:type="dxa" w:w="80"/>
+              <w:bottom w:type="dxa" w:w="20"/>
+              <w:right w:type="dxa" w:w="80"/>
+            </w:tcMar>
+            <w:vAlign w:val="center"/>
+          </w:tcPr>
+          <w:p>
+            <w:pPr>
+              <w:spacing w:line="240"/>
+              <w:ind w:firstLine="0"/>
+              <w:jc w:val="left"/>
+            </w:pPr>
+            <w:r>
+              <w:rPr>
+                <w:rFonts w:ascii="Times New Roman" w:cs="Times New Roman" w:eastAsia="Times New Roman" w:hAnsi="Times New Roman"/>
+                <w:sz w:val="22"/>
+                <w:szCs w:val="22"/>
+              </w:rPr>
+              <w:t xml:space="preserve">—</w:t>
+            </w:r>
+          </w:p>
+        </w:tc>
+        <w:tc>
+          <w:tcPr>
+            <w:tcW w:type="dxa" w:w="1500"/>
+            <w:tcBorders>
+              <w:top w:val="single" w:color="000000" w:sz="4"/>
+              <w:left w:val="single" w:color="000000" w:sz="4"/>
+              <w:bottom w:val="single" w:color="000000" w:sz="4"/>
+              <w:right w:val="single" w:color="000000" w:sz="4"/>
+            </w:tcBorders>
+            <w:tcMar>
+              <w:top w:type="dxa" w:w="20"/>
+              <w:left w:type="dxa" w:w="80"/>
+              <w:bottom w:type="dxa" w:w="20"/>
+              <w:right w:type="dxa" w:w="80"/>
+            </w:tcMar>
+            <w:vAlign w:val="center"/>
+          </w:tcPr>
+          <w:p>
+            <w:pPr>
+              <w:spacing w:line="240"/>
+              <w:ind w:firstLine="0"/>
+              <w:jc w:val="left"/>
+            </w:pPr>
+            <w:r>
+              <w:rPr>
+                <w:rFonts w:ascii="Times New Roman" w:cs="Times New Roman" w:eastAsia="Times New Roman" w:hAnsi="Times New Roman"/>
+                <w:sz w:val="22"/>
+                <w:szCs w:val="22"/>
+              </w:rPr>
+              <w:t xml:space="preserve">—</w:t>
+            </w:r>
+          </w:p>
+        </w:tc>
+        <w:tc>
+          <w:tcPr>
+            <w:tcW w:type="dxa" w:w="2922"/>
+            <w:tcBorders>
+              <w:top w:val="single" w:color="000000" w:sz="4"/>
+              <w:left w:val="single" w:color="000000" w:sz="4"/>
+              <w:bottom w:val="single" w:color="000000" w:sz="4"/>
+              <w:right w:val="single" w:color="000000" w:sz="4"/>
+            </w:tcBorders>
+            <w:tcMar>
+              <w:top w:type="dxa" w:w="20"/>
+              <w:left w:type="dxa" w:w="80"/>
+              <w:bottom w:type="dxa" w:w="20"/>
+              <w:right w:type="dxa" w:w="80"/>
+            </w:tcMar>
+            <w:vAlign w:val="center"/>
+          </w:tcPr>
+          <w:p>
+            <w:pPr>
+              <w:spacing w:line="240"/>
+              <w:ind w:firstLine="0"/>
+              <w:jc w:val="left"/>
+            </w:pPr>
+            <w:r>
+              <w:rPr>
+                <w:rFonts w:ascii="Times New Roman" w:cs="Times New Roman" w:eastAsia="Times New Roman" w:hAnsi="Times New Roman"/>
+                <w:sz w:val="22"/>
+                <w:szCs w:val="22"/>
+              </w:rPr>
+              <w:t xml:space="preserve">Загружает файл исходных данных в новое окно</w:t>
+            </w:r>
+          </w:p>
+        </w:tc>
+      </w:tr>
+      <w:tr>
+        <w:trPr>
+          <w:cantSplit/>
+        </w:trPr>
+        <w:tc>
+          <w:tcPr>
+            <w:tcW w:type="dxa" w:w="2500"/>
+            <w:tcBorders>
+              <w:top w:val="single" w:color="000000" w:sz="4"/>
+              <w:left w:val="single" w:color="000000" w:sz="4"/>
+              <w:bottom w:val="single" w:color="000000" w:sz="4"/>
+              <w:right w:val="single" w:color="000000" w:sz="4"/>
+            </w:tcBorders>
+            <w:tcMar>
+              <w:top w:type="dxa" w:w="20"/>
+              <w:left w:type="dxa" w:w="80"/>
+              <w:bottom w:type="dxa" w:w="20"/>
+              <w:right w:type="dxa" w:w="80"/>
+            </w:tcMar>
+            <w:vAlign w:val="center"/>
+          </w:tcPr>
+          <w:p>
+            <w:pPr>
+              <w:spacing w:line="240"/>
+              <w:ind w:firstLine="0"/>
+              <w:jc w:val="left"/>
+            </w:pPr>
+            <w:r>
+              <w:rPr>
+                <w:rFonts w:ascii="Courier New" w:cs="Courier New" w:eastAsia="Courier New" w:hAnsi="Courier New"/>
+                <w:sz w:val="17"/>
+                <w:szCs w:val="17"/>
+              </w:rPr>
+              <w:t xml:space="preserve">MainForm.SaveData</w:t>
+            </w:r>
+          </w:p>
+        </w:tc>
+        <w:tc>
+          <w:tcPr>
+            <w:tcW w:type="dxa" w:w="3000"/>
+            <w:tcBorders>
+              <w:top w:val="single" w:color="000000" w:sz="4"/>
+              <w:left w:val="single" w:color="000000" w:sz="4"/>
+              <w:bottom w:val="single" w:color="000000" w:sz="4"/>
+              <w:right w:val="single" w:color="000000" w:sz="4"/>
+            </w:tcBorders>
+            <w:tcMar>
+              <w:top w:type="dxa" w:w="20"/>
+              <w:left w:type="dxa" w:w="80"/>
+              <w:bottom w:type="dxa" w:w="20"/>
+              <w:right w:type="dxa" w:w="80"/>
+            </w:tcMar>
+            <w:vAlign w:val="center"/>
+          </w:tcPr>
+          <w:p>
+            <w:pPr>
+              <w:spacing w:line="240"/>
+              <w:ind w:firstLine="0"/>
+              <w:jc w:val="left"/>
+            </w:pPr>
+            <w:r>
+              <w:rPr>
+                <w:rFonts w:ascii="Times New Roman" w:cs="Times New Roman" w:eastAsia="Times New Roman" w:hAnsi="Times New Roman"/>
+                <w:sz w:val="22"/>
+                <w:szCs w:val="22"/>
+              </w:rPr>
+              <w:t xml:space="preserve">—</w:t>
+            </w:r>
+          </w:p>
+        </w:tc>
+        <w:tc>
+          <w:tcPr>
+            <w:tcW w:type="dxa" w:w="1500"/>
+            <w:tcBorders>
+              <w:top w:val="single" w:color="000000" w:sz="4"/>
+              <w:left w:val="single" w:color="000000" w:sz="4"/>
+              <w:bottom w:val="single" w:color="000000" w:sz="4"/>
+              <w:right w:val="single" w:color="000000" w:sz="4"/>
+            </w:tcBorders>
+            <w:tcMar>
+              <w:top w:type="dxa" w:w="20"/>
+              <w:left w:type="dxa" w:w="80"/>
+              <w:bottom w:type="dxa" w:w="20"/>
+              <w:right w:type="dxa" w:w="80"/>
+            </w:tcMar>
+            <w:vAlign w:val="center"/>
+          </w:tcPr>
+          <w:p>
+            <w:pPr>
+              <w:spacing w:line="240"/>
+              <w:ind w:firstLine="0"/>
+              <w:jc w:val="left"/>
+            </w:pPr>
+            <w:r>
+              <w:rPr>
+                <w:rFonts w:ascii="Times New Roman" w:cs="Times New Roman" w:eastAsia="Times New Roman" w:hAnsi="Times New Roman"/>
+                <w:sz w:val="22"/>
+                <w:szCs w:val="22"/>
+              </w:rPr>
+              <w:t xml:space="preserve">—</w:t>
+            </w:r>
+          </w:p>
+        </w:tc>
+        <w:tc>
+          <w:tcPr>
+            <w:tcW w:type="dxa" w:w="2922"/>
+            <w:tcBorders>
+              <w:top w:val="single" w:color="000000" w:sz="4"/>
+              <w:left w:val="single" w:color="000000" w:sz="4"/>
+              <w:bottom w:val="single" w:color="000000" w:sz="4"/>
+              <w:right w:val="single" w:color="000000" w:sz="4"/>
+            </w:tcBorders>
+            <w:tcMar>
+              <w:top w:type="dxa" w:w="20"/>
+              <w:left w:type="dxa" w:w="80"/>
+              <w:bottom w:type="dxa" w:w="20"/>
+              <w:right w:type="dxa" w:w="80"/>
+            </w:tcMar>
+            <w:vAlign w:val="center"/>
+          </w:tcPr>
+          <w:p>
+            <w:pPr>
+              <w:spacing w:line="240"/>
+              <w:ind w:firstLine="0"/>
+              <w:jc w:val="left"/>
+            </w:pPr>
+            <w:r>
+              <w:rPr>
+                <w:rFonts w:ascii="Times New Roman" w:cs="Times New Roman" w:eastAsia="Times New Roman" w:hAnsi="Times New Roman"/>
+                <w:sz w:val="22"/>
+                <w:szCs w:val="22"/>
+              </w:rPr>
+              <w:t xml:space="preserve">Сохраняет исходные данные в файл *.txt</w:t>
+            </w:r>
+          </w:p>
+        </w:tc>
+      </w:tr>
+      <w:tr>
+        <w:trPr>
+          <w:cantSplit/>
+        </w:trPr>
+        <w:tc>
+          <w:tcPr>
+            <w:tcW w:type="dxa" w:w="2500"/>
+            <w:tcBorders>
+              <w:top w:val="single" w:color="000000" w:sz="4"/>
+              <w:left w:val="single" w:color="000000" w:sz="4"/>
+              <w:bottom w:val="single" w:color="000000" w:sz="4"/>
+              <w:right w:val="single" w:color="000000" w:sz="4"/>
+            </w:tcBorders>
+            <w:tcMar>
+              <w:top w:type="dxa" w:w="20"/>
+              <w:left w:type="dxa" w:w="80"/>
+              <w:bottom w:type="dxa" w:w="20"/>
+              <w:right w:type="dxa" w:w="80"/>
+            </w:tcMar>
+            <w:vAlign w:val="center"/>
+          </w:tcPr>
+          <w:p>
+            <w:pPr>
+              <w:spacing w:line="240"/>
+              <w:ind w:firstLine="0"/>
+              <w:jc w:val="left"/>
+            </w:pPr>
+            <w:r>
+              <w:rPr>
+                <w:rFonts w:ascii="Courier New" w:cs="Courier New" w:eastAsia="Courier New" w:hAnsi="Courier New"/>
+                <w:sz w:val="17"/>
+                <w:szCs w:val="17"/>
+              </w:rPr>
+              <w:t xml:space="preserve">MainForm.ShowGraph</w:t>
+            </w:r>
+          </w:p>
+        </w:tc>
+        <w:tc>
+          <w:tcPr>
+            <w:tcW w:type="dxa" w:w="3000"/>
+            <w:tcBorders>
+              <w:top w:val="single" w:color="000000" w:sz="4"/>
+              <w:left w:val="single" w:color="000000" w:sz="4"/>
+              <w:bottom w:val="single" w:color="000000" w:sz="4"/>
+              <w:right w:val="single" w:color="000000" w:sz="4"/>
+            </w:tcBorders>
+            <w:tcMar>
+              <w:top w:type="dxa" w:w="20"/>
+              <w:left w:type="dxa" w:w="80"/>
+              <w:bottom w:type="dxa" w:w="20"/>
+              <w:right w:type="dxa" w:w="80"/>
+            </w:tcMar>
+            <w:vAlign w:val="center"/>
+          </w:tcPr>
+          <w:p>
+            <w:pPr>
+              <w:spacing w:line="240"/>
+              <w:ind w:firstLine="0"/>
+              <w:jc w:val="left"/>
+            </w:pPr>
+            <w:r>
+              <w:rPr>
+                <w:rFonts w:ascii="Times New Roman" w:cs="Times New Roman" w:eastAsia="Times New Roman" w:hAnsi="Times New Roman"/>
+                <w:sz w:val="22"/>
+                <w:szCs w:val="22"/>
+              </w:rPr>
+              <w:t xml:space="preserve">—</w:t>
+            </w:r>
+          </w:p>
+        </w:tc>
+        <w:tc>
+          <w:tcPr>
+            <w:tcW w:type="dxa" w:w="1500"/>
+            <w:tcBorders>
+              <w:top w:val="single" w:color="000000" w:sz="4"/>
+              <w:left w:val="single" w:color="000000" w:sz="4"/>
+              <w:bottom w:val="single" w:color="000000" w:sz="4"/>
+              <w:right w:val="single" w:color="000000" w:sz="4"/>
+            </w:tcBorders>
+            <w:tcMar>
+              <w:top w:type="dxa" w:w="20"/>
+              <w:left w:type="dxa" w:w="80"/>
+              <w:bottom w:type="dxa" w:w="20"/>
+              <w:right w:type="dxa" w:w="80"/>
+            </w:tcMar>
+            <w:vAlign w:val="center"/>
+          </w:tcPr>
+          <w:p>
+            <w:pPr>
+              <w:spacing w:line="240"/>
+              <w:ind w:firstLine="0"/>
+              <w:jc w:val="left"/>
+            </w:pPr>
+            <w:r>
+              <w:rPr>
+                <w:rFonts w:ascii="Times New Roman" w:cs="Times New Roman" w:eastAsia="Times New Roman" w:hAnsi="Times New Roman"/>
+                <w:sz w:val="22"/>
+                <w:szCs w:val="22"/>
+              </w:rPr>
+              <w:t xml:space="preserve">—</w:t>
+            </w:r>
+          </w:p>
+        </w:tc>
+        <w:tc>
+          <w:tcPr>
+            <w:tcW w:type="dxa" w:w="2922"/>
+            <w:tcBorders>
+              <w:top w:val="single" w:color="000000" w:sz="4"/>
+              <w:left w:val="single" w:color="000000" w:sz="4"/>
+              <w:bottom w:val="single" w:color="000000" w:sz="4"/>
+              <w:right w:val="single" w:color="000000" w:sz="4"/>
+            </w:tcBorders>
+            <w:tcMar>
+              <w:top w:type="dxa" w:w="20"/>
+              <w:left w:type="dxa" w:w="80"/>
+              <w:bottom w:type="dxa" w:w="20"/>
+              <w:right w:type="dxa" w:w="80"/>
+            </w:tcMar>
+            <w:vAlign w:val="center"/>
+          </w:tcPr>
+          <w:p>
+            <w:pPr>
+              <w:spacing w:line="240"/>
+              <w:ind w:firstLine="0"/>
+              <w:jc w:val="left"/>
+            </w:pPr>
+            <w:r>
+              <w:rPr>
+                <w:rFonts w:ascii="Times New Roman" w:cs="Times New Roman" w:eastAsia="Times New Roman" w:hAnsi="Times New Roman"/>
+                <w:sz w:val="22"/>
+                <w:szCs w:val="22"/>
+              </w:rPr>
+              <w:t xml:space="preserve">Открывает окно с графиком</w:t>
+            </w:r>
+          </w:p>
+        </w:tc>
+      </w:tr>
+      <w:tr>
+        <w:trPr>
+          <w:cantSplit/>
+        </w:trPr>
+        <w:tc>
+          <w:tcPr>
+            <w:tcW w:type="dxa" w:w="2500"/>
+            <w:tcBorders>
+              <w:top w:val="single" w:color="000000" w:sz="4"/>
+              <w:left w:val="single" w:color="000000" w:sz="4"/>
+              <w:bottom w:val="single" w:color="000000" w:sz="4"/>
+              <w:right w:val="single" w:color="000000" w:sz="4"/>
+            </w:tcBorders>
+            <w:tcMar>
+              <w:top w:type="dxa" w:w="20"/>
+              <w:left w:type="dxa" w:w="80"/>
+              <w:bottom w:type="dxa" w:w="20"/>
+              <w:right w:type="dxa" w:w="80"/>
+            </w:tcMar>
+            <w:vAlign w:val="center"/>
+          </w:tcPr>
+          <w:p>
+            <w:pPr>
+              <w:spacing w:line="240"/>
+              <w:ind w:firstLine="0"/>
+              <w:jc w:val="left"/>
+            </w:pPr>
+            <w:r>
+              <w:rPr>
+                <w:rFonts w:ascii="Courier New" w:cs="Courier New" w:eastAsia="Courier New" w:hAnsi="Courier New"/>
+                <w:sz w:val="17"/>
+                <w:szCs w:val="17"/>
+              </w:rPr>
+              <w:t xml:space="preserve">MainForm.ShowHelp</w:t>
+            </w:r>
+          </w:p>
+        </w:tc>
+        <w:tc>
+          <w:tcPr>
+            <w:tcW w:type="dxa" w:w="3000"/>
+            <w:tcBorders>
+              <w:top w:val="single" w:color="000000" w:sz="4"/>
+              <w:left w:val="single" w:color="000000" w:sz="4"/>
+              <w:bottom w:val="single" w:color="000000" w:sz="4"/>
+              <w:right w:val="single" w:color="000000" w:sz="4"/>
+            </w:tcBorders>
+            <w:tcMar>
+              <w:top w:type="dxa" w:w="20"/>
+              <w:left w:type="dxa" w:w="80"/>
+              <w:bottom w:type="dxa" w:w="20"/>
+              <w:right w:type="dxa" w:w="80"/>
+            </w:tcMar>
+            <w:vAlign w:val="center"/>
+          </w:tcPr>
+          <w:p>
+            <w:pPr>
+              <w:spacing w:line="240"/>
+              <w:ind w:firstLine="0"/>
+              <w:jc w:val="left"/>
+            </w:pPr>
+            <w:r>
+              <w:rPr>
+                <w:rFonts w:ascii="Times New Roman" w:cs="Times New Roman" w:eastAsia="Times New Roman" w:hAnsi="Times New Roman"/>
+                <w:sz w:val="22"/>
+                <w:szCs w:val="22"/>
+              </w:rPr>
+              <w:t xml:space="preserve">int section</w:t>
+            </w:r>
+          </w:p>
+        </w:tc>
+        <w:tc>
+          <w:tcPr>
+            <w:tcW w:type="dxa" w:w="1500"/>
+            <w:tcBorders>
+              <w:top w:val="single" w:color="000000" w:sz="4"/>
+              <w:left w:val="single" w:color="000000" w:sz="4"/>
+              <w:bottom w:val="single" w:color="000000" w:sz="4"/>
+              <w:right w:val="single" w:color="000000" w:sz="4"/>
+            </w:tcBorders>
+            <w:tcMar>
+              <w:top w:type="dxa" w:w="20"/>
+              <w:left w:type="dxa" w:w="80"/>
+              <w:bottom w:type="dxa" w:w="20"/>
+              <w:right w:type="dxa" w:w="80"/>
+            </w:tcMar>
+            <w:vAlign w:val="center"/>
+          </w:tcPr>
+          <w:p>
+            <w:pPr>
+              <w:spacing w:line="240"/>
+              <w:ind w:firstLine="0"/>
+              <w:jc w:val="left"/>
+            </w:pPr>
+            <w:r>
+              <w:rPr>
+                <w:rFonts w:ascii="Times New Roman" w:cs="Times New Roman" w:eastAsia="Times New Roman" w:hAnsi="Times New Roman"/>
+                <w:sz w:val="22"/>
+                <w:szCs w:val="22"/>
+              </w:rPr>
+              <w:t xml:space="preserve">—</w:t>
+            </w:r>
+          </w:p>
+        </w:tc>
+        <w:tc>
+          <w:tcPr>
+            <w:tcW w:type="dxa" w:w="2922"/>
+            <w:tcBorders>
+              <w:top w:val="single" w:color="000000" w:sz="4"/>
+              <w:left w:val="single" w:color="000000" w:sz="4"/>
+              <w:bottom w:val="single" w:color="000000" w:sz="4"/>
+              <w:right w:val="single" w:color="000000" w:sz="4"/>
+            </w:tcBorders>
+            <w:tcMar>
+              <w:top w:type="dxa" w:w="20"/>
+              <w:left w:type="dxa" w:w="80"/>
+              <w:bottom w:type="dxa" w:w="20"/>
+              <w:right w:type="dxa" w:w="80"/>
+            </w:tcMar>
+            <w:vAlign w:val="center"/>
+          </w:tcPr>
+          <w:p>
+            <w:pPr>
+              <w:spacing w:line="240"/>
+              <w:ind w:firstLine="0"/>
+              <w:jc w:val="left"/>
+            </w:pPr>
+            <w:r>
+              <w:rPr>
+                <w:rFonts w:ascii="Times New Roman" w:cs="Times New Roman" w:eastAsia="Times New Roman" w:hAnsi="Times New Roman"/>
+                <w:sz w:val="22"/>
+                <w:szCs w:val="22"/>
+              </w:rPr>
+              <w:t xml:space="preserve">Открывает справку на нужном разделе</w:t>
+            </w:r>
+          </w:p>
+        </w:tc>
+      </w:tr>
+      <w:tr>
+        <w:trPr>
+          <w:cantSplit/>
+        </w:trPr>
+        <w:tc>
+          <w:tcPr>
+            <w:tcW w:type="dxa" w:w="2500"/>
+            <w:tcBorders>
+              <w:top w:val="single" w:color="000000" w:sz="4"/>
+              <w:left w:val="single" w:color="000000" w:sz="4"/>
+              <w:bottom w:val="single" w:color="000000" w:sz="4"/>
+              <w:right w:val="single" w:color="000000" w:sz="4"/>
+            </w:tcBorders>
+            <w:tcMar>
+              <w:top w:type="dxa" w:w="20"/>
+              <w:left w:type="dxa" w:w="80"/>
+              <w:bottom w:type="dxa" w:w="20"/>
+              <w:right w:type="dxa" w:w="80"/>
+            </w:tcMar>
+            <w:vAlign w:val="center"/>
+          </w:tcPr>
+          <w:p>
+            <w:pPr>
+              <w:spacing w:line="240"/>
+              <w:ind w:firstLine="0"/>
+              <w:jc w:val="left"/>
+            </w:pPr>
+            <w:r>
+              <w:rPr>
+                <w:rFonts w:ascii="Courier New" w:cs="Courier New" w:eastAsia="Courier New" w:hAnsi="Courier New"/>
+                <w:sz w:val="17"/>
+                <w:szCs w:val="17"/>
+              </w:rPr>
+              <w:t xml:space="preserve">MainForm.UpdateCommands</w:t>
+            </w:r>
+          </w:p>
+        </w:tc>
+        <w:tc>
+          <w:tcPr>
+            <w:tcW w:type="dxa" w:w="3000"/>
+            <w:tcBorders>
+              <w:top w:val="single" w:color="000000" w:sz="4"/>
+              <w:left w:val="single" w:color="000000" w:sz="4"/>
+              <w:bottom w:val="single" w:color="000000" w:sz="4"/>
+              <w:right w:val="single" w:color="000000" w:sz="4"/>
+            </w:tcBorders>
+            <w:tcMar>
+              <w:top w:type="dxa" w:w="20"/>
+              <w:left w:type="dxa" w:w="80"/>
+              <w:bottom w:type="dxa" w:w="20"/>
+              <w:right w:type="dxa" w:w="80"/>
+            </w:tcMar>
+            <w:vAlign w:val="center"/>
+          </w:tcPr>
+          <w:p>
+            <w:pPr>
+              <w:spacing w:line="240"/>
+              <w:ind w:firstLine="0"/>
+              <w:jc w:val="left"/>
+            </w:pPr>
+            <w:r>
+              <w:rPr>
+                <w:rFonts w:ascii="Times New Roman" w:cs="Times New Roman" w:eastAsia="Times New Roman" w:hAnsi="Times New Roman"/>
+                <w:sz w:val="22"/>
+                <w:szCs w:val="22"/>
+              </w:rPr>
+              <w:t xml:space="preserve">—</w:t>
+            </w:r>
+          </w:p>
+        </w:tc>
+        <w:tc>
+          <w:tcPr>
+            <w:tcW w:type="dxa" w:w="1500"/>
+            <w:tcBorders>
+              <w:top w:val="single" w:color="000000" w:sz="4"/>
+              <w:left w:val="single" w:color="000000" w:sz="4"/>
+              <w:bottom w:val="single" w:color="000000" w:sz="4"/>
+              <w:right w:val="single" w:color="000000" w:sz="4"/>
+            </w:tcBorders>
+            <w:tcMar>
+              <w:top w:type="dxa" w:w="20"/>
+              <w:left w:type="dxa" w:w="80"/>
+              <w:bottom w:type="dxa" w:w="20"/>
+              <w:right w:type="dxa" w:w="80"/>
+            </w:tcMar>
+            <w:vAlign w:val="center"/>
+          </w:tcPr>
+          <w:p>
+            <w:pPr>
+              <w:spacing w:line="240"/>
+              <w:ind w:firstLine="0"/>
+              <w:jc w:val="left"/>
+            </w:pPr>
+            <w:r>
+              <w:rPr>
+                <w:rFonts w:ascii="Times New Roman" w:cs="Times New Roman" w:eastAsia="Times New Roman" w:hAnsi="Times New Roman"/>
+                <w:sz w:val="22"/>
+                <w:szCs w:val="22"/>
+              </w:rPr>
+              <w:t xml:space="preserve">—</w:t>
+            </w:r>
+          </w:p>
+        </w:tc>
+        <w:tc>
+          <w:tcPr>
+            <w:tcW w:type="dxa" w:w="2922"/>
+            <w:tcBorders>
+              <w:top w:val="single" w:color="000000" w:sz="4"/>
+              <w:left w:val="single" w:color="000000" w:sz="4"/>
+              <w:bottom w:val="single" w:color="000000" w:sz="4"/>
+              <w:right w:val="single" w:color="000000" w:sz="4"/>
+            </w:tcBorders>
+            <w:tcMar>
+              <w:top w:type="dxa" w:w="20"/>
+              <w:left w:type="dxa" w:w="80"/>
+              <w:bottom w:type="dxa" w:w="20"/>
+              <w:right w:type="dxa" w:w="80"/>
+            </w:tcMar>
+            <w:vAlign w:val="center"/>
+          </w:tcPr>
+          <w:p>
+            <w:pPr>
+              <w:spacing w:line="240"/>
+              <w:ind w:firstLine="0"/>
+              <w:jc w:val="left"/>
+            </w:pPr>
+            <w:r>
+              <w:rPr>
+                <w:rFonts w:ascii="Times New Roman" w:cs="Times New Roman" w:eastAsia="Times New Roman" w:hAnsi="Times New Roman"/>
+                <w:sz w:val="22"/>
+                <w:szCs w:val="22"/>
+              </w:rPr>
+              <w:t xml:space="preserve">Включает и выключает команды меню и панели инструментов</w:t>
+            </w:r>
+          </w:p>
+        </w:tc>
+      </w:tr>
+      <w:tr>
+        <w:trPr>
+          <w:cantSplit/>
+        </w:trPr>
+        <w:tc>
+          <w:tcPr>
+            <w:tcW w:type="dxa" w:w="2500"/>
+            <w:tcBorders>
+              <w:top w:val="single" w:color="000000" w:sz="4"/>
+              <w:left w:val="single" w:color="000000" w:sz="4"/>
+              <w:bottom w:val="single" w:color="000000" w:sz="4"/>
+              <w:right w:val="single" w:color="000000" w:sz="4"/>
+            </w:tcBorders>
+            <w:tcMar>
+              <w:top w:type="dxa" w:w="20"/>
+              <w:left w:type="dxa" w:w="80"/>
+              <w:bottom w:type="dxa" w:w="20"/>
+              <w:right w:type="dxa" w:w="80"/>
+            </w:tcMar>
+            <w:vAlign w:val="center"/>
+          </w:tcPr>
+          <w:p>
+            <w:pPr>
+              <w:spacing w:line="240"/>
+              <w:ind w:firstLine="0"/>
+              <w:jc w:val="left"/>
+            </w:pPr>
+            <w:r>
+              <w:rPr>
+                <w:rFonts w:ascii="Courier New" w:cs="Courier New" w:eastAsia="Courier New" w:hAnsi="Courier New"/>
+                <w:sz w:val="17"/>
+                <w:szCs w:val="17"/>
+              </w:rPr>
+              <w:t xml:space="preserve">IconFactory.Create</w:t>
+            </w:r>
+          </w:p>
+        </w:tc>
+        <w:tc>
+          <w:tcPr>
+            <w:tcW w:type="dxa" w:w="3000"/>
+            <w:tcBorders>
+              <w:top w:val="single" w:color="000000" w:sz="4"/>
+              <w:left w:val="single" w:color="000000" w:sz="4"/>
+              <w:bottom w:val="single" w:color="000000" w:sz="4"/>
+              <w:right w:val="single" w:color="000000" w:sz="4"/>
+            </w:tcBorders>
+            <w:tcMar>
+              <w:top w:type="dxa" w:w="20"/>
+              <w:left w:type="dxa" w:w="80"/>
+              <w:bottom w:type="dxa" w:w="20"/>
+              <w:right w:type="dxa" w:w="80"/>
+            </w:tcMar>
+            <w:vAlign w:val="center"/>
+          </w:tcPr>
+          <w:p>
+            <w:pPr>
+              <w:spacing w:line="240"/>
+              <w:ind w:firstLine="0"/>
+              <w:jc w:val="left"/>
+            </w:pPr>
+            <w:r>
+              <w:rPr>
+                <w:rFonts w:ascii="Times New Roman" w:cs="Times New Roman" w:eastAsia="Times New Roman" w:hAnsi="Times New Roman"/>
+                <w:sz w:val="22"/>
+                <w:szCs w:val="22"/>
+              </w:rPr>
+              <w:t xml:space="preserve">Kind kind, int size</w:t>
+            </w:r>
+          </w:p>
+        </w:tc>
+        <w:tc>
+          <w:tcPr>
+            <w:tcW w:type="dxa" w:w="1500"/>
+            <w:tcBorders>
+              <w:top w:val="single" w:color="000000" w:sz="4"/>
+              <w:left w:val="single" w:color="000000" w:sz="4"/>
+              <w:bottom w:val="single" w:color="000000" w:sz="4"/>
+              <w:right w:val="single" w:color="000000" w:sz="4"/>
+            </w:tcBorders>
+            <w:tcMar>
+              <w:top w:type="dxa" w:w="20"/>
+              <w:left w:type="dxa" w:w="80"/>
+              <w:bottom w:type="dxa" w:w="20"/>
+              <w:right w:type="dxa" w:w="80"/>
+            </w:tcMar>
+            <w:vAlign w:val="center"/>
+          </w:tcPr>
+          <w:p>
+            <w:pPr>
+              <w:spacing w:line="240"/>
+              <w:ind w:firstLine="0"/>
+              <w:jc w:val="left"/>
+            </w:pPr>
+            <w:r>
+              <w:rPr>
+                <w:rFonts w:ascii="Times New Roman" w:cs="Times New Roman" w:eastAsia="Times New Roman" w:hAnsi="Times New Roman"/>
+                <w:sz w:val="22"/>
+                <w:szCs w:val="22"/>
+              </w:rPr>
+              <w:t xml:space="preserve">Bitmap</w:t>
+            </w:r>
+          </w:p>
+        </w:tc>
+        <w:tc>
+          <w:tcPr>
+            <w:tcW w:type="dxa" w:w="2922"/>
+            <w:tcBorders>
+              <w:top w:val="single" w:color="000000" w:sz="4"/>
+              <w:left w:val="single" w:color="000000" w:sz="4"/>
+              <w:bottom w:val="single" w:color="000000" w:sz="4"/>
+              <w:right w:val="single" w:color="000000" w:sz="4"/>
+            </w:tcBorders>
+            <w:tcMar>
+              <w:top w:type="dxa" w:w="20"/>
+              <w:left w:type="dxa" w:w="80"/>
+              <w:bottom w:type="dxa" w:w="20"/>
+              <w:right w:type="dxa" w:w="80"/>
+            </w:tcMar>
+            <w:vAlign w:val="center"/>
+          </w:tcPr>
+          <w:p>
+            <w:pPr>
+              <w:spacing w:line="240"/>
+              <w:ind w:firstLine="0"/>
+              <w:jc w:val="left"/>
+            </w:pPr>
+            <w:r>
+              <w:rPr>
+                <w:rFonts w:ascii="Times New Roman" w:cs="Times New Roman" w:eastAsia="Times New Roman" w:hAnsi="Times New Roman"/>
+                <w:sz w:val="22"/>
+                <w:szCs w:val="22"/>
+              </w:rPr>
+              <w:t xml:space="preserve">Рисует значок панели инструментов</w:t>
+            </w:r>
+          </w:p>
+        </w:tc>
+      </w:tr>
+      <w:tr>
+        <w:trPr>
+          <w:cantSplit/>
+        </w:trPr>
+        <w:tc>
+          <w:tcPr>
+            <w:tcW w:type="dxa" w:w="2500"/>
+            <w:tcBorders>
+              <w:top w:val="single" w:color="000000" w:sz="4"/>
+              <w:left w:val="single" w:color="000000" w:sz="4"/>
+              <w:bottom w:val="single" w:color="000000" w:sz="4"/>
+              <w:right w:val="single" w:color="000000" w:sz="4"/>
+            </w:tcBorders>
+            <w:tcMar>
+              <w:top w:type="dxa" w:w="20"/>
+              <w:left w:type="dxa" w:w="80"/>
+              <w:bottom w:type="dxa" w:w="20"/>
+              <w:right w:type="dxa" w:w="80"/>
+            </w:tcMar>
+            <w:vAlign w:val="center"/>
+          </w:tcPr>
+          <w:p>
+            <w:pPr>
+              <w:spacing w:line="240"/>
+              <w:ind w:firstLine="0"/>
+              <w:jc w:val="left"/>
+            </w:pPr>
+            <w:r>
+              <w:rPr>
+                <w:rFonts w:ascii="Courier New" w:cs="Courier New" w:eastAsia="Courier New" w:hAnsi="Courier New"/>
+                <w:sz w:val="17"/>
+                <w:szCs w:val="17"/>
+              </w:rPr>
               <w:t xml:space="preserve">Messages.Text</w:t>
             </w:r>
           </w:p>
@@ -17369,9 +20246,9 @@
         <w:tblLayout w:type="fixed"/>
       </w:tblPr>
       <w:tblGrid>
-        <w:gridCol w:w="2300"/>
+        <w:gridCol w:w="2500"/>
         <w:gridCol w:w="1900"/>
-        <w:gridCol w:w="5722"/>
+        <w:gridCol w:w="5522"/>
       </w:tblGrid>
       <w:tr>
         <w:trPr>
@@ -17380,7 +20257,7 @@
         </w:trPr>
         <w:tc>
           <w:tcPr>
-            <w:tcW w:type="dxa" w:w="2300"/>
+            <w:tcW w:type="dxa" w:w="2500"/>
             <w:tcBorders>
               <w:top w:val="single" w:color="000000" w:sz="4"/>
               <w:left w:val="single" w:color="000000" w:sz="4"/>
@@ -17450,7 +20327,7 @@
         </w:tc>
         <w:tc>
           <w:tcPr>
-            <w:tcW w:type="dxa" w:w="5722"/>
+            <w:tcW w:type="dxa" w:w="5522"/>
             <w:tcBorders>
               <w:top w:val="single" w:color="000000" w:sz="4"/>
               <w:left w:val="single" w:color="000000" w:sz="4"/>
@@ -17490,7 +20367,7 @@
         </w:trPr>
         <w:tc>
           <w:tcPr>
-            <w:tcW w:type="dxa" w:w="2300"/>
+            <w:tcW w:type="dxa" w:w="2500"/>
             <w:tcBorders>
               <w:top w:val="single" w:color="000000" w:sz="4"/>
               <w:left w:val="single" w:color="000000" w:sz="4"/>
@@ -17556,7 +20433,7 @@
         </w:tc>
         <w:tc>
           <w:tcPr>
-            <w:tcW w:type="dxa" w:w="5722"/>
+            <w:tcW w:type="dxa" w:w="5522"/>
             <w:tcBorders>
               <w:top w:val="single" w:color="000000" w:sz="4"/>
               <w:left w:val="single" w:color="000000" w:sz="4"/>
@@ -17594,7 +20471,7 @@
         </w:trPr>
         <w:tc>
           <w:tcPr>
-            <w:tcW w:type="dxa" w:w="2300"/>
+            <w:tcW w:type="dxa" w:w="2500"/>
             <w:tcBorders>
               <w:top w:val="single" w:color="000000" w:sz="4"/>
               <w:left w:val="single" w:color="000000" w:sz="4"/>
@@ -17660,7 +20537,7 @@
         </w:tc>
         <w:tc>
           <w:tcPr>
-            <w:tcW w:type="dxa" w:w="5722"/>
+            <w:tcW w:type="dxa" w:w="5522"/>
             <w:tcBorders>
               <w:top w:val="single" w:color="000000" w:sz="4"/>
               <w:left w:val="single" w:color="000000" w:sz="4"/>
@@ -17698,7 +20575,7 @@
         </w:trPr>
         <w:tc>
           <w:tcPr>
-            <w:tcW w:type="dxa" w:w="2300"/>
+            <w:tcW w:type="dxa" w:w="2500"/>
             <w:tcBorders>
               <w:top w:val="single" w:color="000000" w:sz="4"/>
               <w:left w:val="single" w:color="000000" w:sz="4"/>
@@ -17764,7 +20641,7 @@
         </w:tc>
         <w:tc>
           <w:tcPr>
-            <w:tcW w:type="dxa" w:w="5722"/>
+            <w:tcW w:type="dxa" w:w="5522"/>
             <w:tcBorders>
               <w:top w:val="single" w:color="000000" w:sz="4"/>
               <w:left w:val="single" w:color="000000" w:sz="4"/>
@@ -17802,7 +20679,7 @@
         </w:trPr>
         <w:tc>
           <w:tcPr>
-            <w:tcW w:type="dxa" w:w="2300"/>
+            <w:tcW w:type="dxa" w:w="2500"/>
             <w:tcBorders>
               <w:top w:val="single" w:color="000000" w:sz="4"/>
               <w:left w:val="single" w:color="000000" w:sz="4"/>
@@ -17868,7 +20745,7 @@
         </w:tc>
         <w:tc>
           <w:tcPr>
-            <w:tcW w:type="dxa" w:w="5722"/>
+            <w:tcW w:type="dxa" w:w="5522"/>
             <w:tcBorders>
               <w:top w:val="single" w:color="000000" w:sz="4"/>
               <w:left w:val="single" w:color="000000" w:sz="4"/>
@@ -17906,7 +20783,7 @@
         </w:trPr>
         <w:tc>
           <w:tcPr>
-            <w:tcW w:type="dxa" w:w="2300"/>
+            <w:tcW w:type="dxa" w:w="2500"/>
             <w:tcBorders>
               <w:top w:val="single" w:color="000000" w:sz="4"/>
               <w:left w:val="single" w:color="000000" w:sz="4"/>
@@ -17972,34 +20849,34 @@
         </w:tc>
         <w:tc>
           <w:tcPr>
-            <w:tcW w:type="dxa" w:w="5722"/>
-            <w:tcBorders>
-              <w:top w:val="single" w:color="000000" w:sz="4"/>
-              <w:left w:val="single" w:color="000000" w:sz="4"/>
-              <w:bottom w:val="single" w:color="000000" w:sz="4"/>
-              <w:right w:val="single" w:color="000000" w:sz="4"/>
-            </w:tcBorders>
-            <w:tcMar>
-              <w:top w:type="dxa" w:w="20"/>
-              <w:left w:type="dxa" w:w="80"/>
-              <w:bottom w:type="dxa" w:w="20"/>
-              <w:right w:type="dxa" w:w="80"/>
-            </w:tcMar>
-            <w:vAlign w:val="center"/>
-          </w:tcPr>
-          <w:p>
-            <w:pPr>
-              <w:spacing w:line="240"/>
-              <w:ind w:firstLine="0"/>
-              <w:jc w:val="left"/>
-            </w:pPr>
-            <w:r>
-              <w:rPr>
-                <w:rFonts w:ascii="Times New Roman" w:cs="Times New Roman" w:eastAsia="Times New Roman" w:hAnsi="Times New Roman"/>
-                <w:sz w:val="22"/>
-                <w:szCs w:val="22"/>
-              </w:rPr>
-              <w:t xml:space="preserve">Метод: трапеций, Симпсона, оба</w:t>
+            <w:tcW w:type="dxa" w:w="5522"/>
+            <w:tcBorders>
+              <w:top w:val="single" w:color="000000" w:sz="4"/>
+              <w:left w:val="single" w:color="000000" w:sz="4"/>
+              <w:bottom w:val="single" w:color="000000" w:sz="4"/>
+              <w:right w:val="single" w:color="000000" w:sz="4"/>
+            </w:tcBorders>
+            <w:tcMar>
+              <w:top w:type="dxa" w:w="20"/>
+              <w:left w:type="dxa" w:w="80"/>
+              <w:bottom w:type="dxa" w:w="20"/>
+              <w:right w:type="dxa" w:w="80"/>
+            </w:tcMar>
+            <w:vAlign w:val="center"/>
+          </w:tcPr>
+          <w:p>
+            <w:pPr>
+              <w:spacing w:line="240"/>
+              <w:ind w:firstLine="0"/>
+              <w:jc w:val="left"/>
+            </w:pPr>
+            <w:r>
+              <w:rPr>
+                <w:rFonts w:ascii="Times New Roman" w:cs="Times New Roman" w:eastAsia="Times New Roman" w:hAnsi="Times New Roman"/>
+                <w:sz w:val="22"/>
+                <w:szCs w:val="22"/>
+              </w:rPr>
+              <w:t xml:space="preserve">Метод: трапеций, Симпсона, оба метода</w:t>
             </w:r>
           </w:p>
         </w:tc>
@@ -18010,7 +20887,7 @@
         </w:trPr>
         <w:tc>
           <w:tcPr>
-            <w:tcW w:type="dxa" w:w="2300"/>
+            <w:tcW w:type="dxa" w:w="2500"/>
             <w:tcBorders>
               <w:top w:val="single" w:color="000000" w:sz="4"/>
               <w:left w:val="single" w:color="000000" w:sz="4"/>
@@ -18076,7 +20953,7 @@
         </w:tc>
         <w:tc>
           <w:tcPr>
-            <w:tcW w:type="dxa" w:w="5722"/>
+            <w:tcW w:type="dxa" w:w="5522"/>
             <w:tcBorders>
               <w:top w:val="single" w:color="000000" w:sz="4"/>
               <w:left w:val="single" w:color="000000" w:sz="4"/>
@@ -18114,7 +20991,7 @@
         </w:trPr>
         <w:tc>
           <w:tcPr>
-            <w:tcW w:type="dxa" w:w="2300"/>
+            <w:tcW w:type="dxa" w:w="2500"/>
             <w:tcBorders>
               <w:top w:val="single" w:color="000000" w:sz="4"/>
               <w:left w:val="single" w:color="000000" w:sz="4"/>
@@ -18180,7 +21057,7 @@
         </w:tc>
         <w:tc>
           <w:tcPr>
-            <w:tcW w:type="dxa" w:w="5722"/>
+            <w:tcW w:type="dxa" w:w="5522"/>
             <w:tcBorders>
               <w:top w:val="single" w:color="000000" w:sz="4"/>
               <w:left w:val="single" w:color="000000" w:sz="4"/>
@@ -18218,7 +21095,7 @@
         </w:trPr>
         <w:tc>
           <w:tcPr>
-            <w:tcW w:type="dxa" w:w="2300"/>
+            <w:tcW w:type="dxa" w:w="2500"/>
             <w:tcBorders>
               <w:top w:val="single" w:color="000000" w:sz="4"/>
               <w:left w:val="single" w:color="000000" w:sz="4"/>
@@ -18284,7 +21161,7 @@
         </w:tc>
         <w:tc>
           <w:tcPr>
-            <w:tcW w:type="dxa" w:w="5722"/>
+            <w:tcW w:type="dxa" w:w="5522"/>
             <w:tcBorders>
               <w:top w:val="single" w:color="000000" w:sz="4"/>
               <w:left w:val="single" w:color="000000" w:sz="4"/>
@@ -18322,7 +21199,7 @@
         </w:trPr>
         <w:tc>
           <w:tcPr>
-            <w:tcW w:type="dxa" w:w="2300"/>
+            <w:tcW w:type="dxa" w:w="2500"/>
             <w:tcBorders>
               <w:top w:val="single" w:color="000000" w:sz="4"/>
               <w:left w:val="single" w:color="000000" w:sz="4"/>
@@ -18349,7 +21226,7 @@
                 <w:sz w:val="17"/>
                 <w:szCs w:val="17"/>
               </w:rPr>
-              <w:t xml:space="preserve">txtValue, txtStep, txtError, txtEvals, txtTime</w:t>
+              <w:t xml:space="preserve">dgvSummary</w:t>
             </w:r>
           </w:p>
         </w:tc>
@@ -18382,40 +21259,40 @@
                 <w:sz w:val="22"/>
                 <w:szCs w:val="22"/>
               </w:rPr>
-              <w:t xml:space="preserve">TextBox (только чтение)</w:t>
-            </w:r>
-          </w:p>
-        </w:tc>
-        <w:tc>
-          <w:tcPr>
-            <w:tcW w:type="dxa" w:w="5722"/>
-            <w:tcBorders>
-              <w:top w:val="single" w:color="000000" w:sz="4"/>
-              <w:left w:val="single" w:color="000000" w:sz="4"/>
-              <w:bottom w:val="single" w:color="000000" w:sz="4"/>
-              <w:right w:val="single" w:color="000000" w:sz="4"/>
-            </w:tcBorders>
-            <w:tcMar>
-              <w:top w:type="dxa" w:w="20"/>
-              <w:left w:type="dxa" w:w="80"/>
-              <w:bottom w:type="dxa" w:w="20"/>
-              <w:right w:type="dxa" w:w="80"/>
-            </w:tcMar>
-            <w:vAlign w:val="center"/>
-          </w:tcPr>
-          <w:p>
-            <w:pPr>
-              <w:spacing w:line="240"/>
-              <w:ind w:firstLine="0"/>
-              <w:jc w:val="left"/>
-            </w:pPr>
-            <w:r>
-              <w:rPr>
-                <w:rFonts w:ascii="Times New Roman" w:cs="Times New Roman" w:eastAsia="Times New Roman" w:hAnsi="Times New Roman"/>
-                <w:sz w:val="22"/>
-                <w:szCs w:val="22"/>
-              </w:rPr>
-              <w:t xml:space="preserve">Значение интеграла, шаг, оценка погрешности, число вычислений, время</w:t>
+              <w:t xml:space="preserve">DataGridView</w:t>
+            </w:r>
+          </w:p>
+        </w:tc>
+        <w:tc>
+          <w:tcPr>
+            <w:tcW w:type="dxa" w:w="5522"/>
+            <w:tcBorders>
+              <w:top w:val="single" w:color="000000" w:sz="4"/>
+              <w:left w:val="single" w:color="000000" w:sz="4"/>
+              <w:bottom w:val="single" w:color="000000" w:sz="4"/>
+              <w:right w:val="single" w:color="000000" w:sz="4"/>
+            </w:tcBorders>
+            <w:tcMar>
+              <w:top w:type="dxa" w:w="20"/>
+              <w:left w:type="dxa" w:w="80"/>
+              <w:bottom w:type="dxa" w:w="20"/>
+              <w:right w:type="dxa" w:w="80"/>
+            </w:tcMar>
+            <w:vAlign w:val="center"/>
+          </w:tcPr>
+          <w:p>
+            <w:pPr>
+              <w:spacing w:line="240"/>
+              <w:ind w:firstLine="0"/>
+              <w:jc w:val="left"/>
+            </w:pPr>
+            <w:r>
+              <w:rPr>
+                <w:rFonts w:ascii="Times New Roman" w:cs="Times New Roman" w:eastAsia="Times New Roman" w:hAnsi="Times New Roman"/>
+                <w:sz w:val="22"/>
+                <w:szCs w:val="22"/>
+              </w:rPr>
+              <w:t xml:space="preserve">Сводная таблица: метод, интеграл, n, h, оценка погрешности, порядок, число вычислений f(x), время</w:t>
             </w:r>
           </w:p>
         </w:tc>
@@ -18426,7 +21303,7 @@
         </w:trPr>
         <w:tc>
           <w:tcPr>
-            <w:tcW w:type="dxa" w:w="2300"/>
+            <w:tcW w:type="dxa" w:w="2500"/>
             <w:tcBorders>
               <w:top w:val="single" w:color="000000" w:sz="4"/>
               <w:left w:val="single" w:color="000000" w:sz="4"/>
@@ -18492,34 +21369,34 @@
         </w:tc>
         <w:tc>
           <w:tcPr>
-            <w:tcW w:type="dxa" w:w="5722"/>
-            <w:tcBorders>
-              <w:top w:val="single" w:color="000000" w:sz="4"/>
-              <w:left w:val="single" w:color="000000" w:sz="4"/>
-              <w:bottom w:val="single" w:color="000000" w:sz="4"/>
-              <w:right w:val="single" w:color="000000" w:sz="4"/>
-            </w:tcBorders>
-            <w:tcMar>
-              <w:top w:type="dxa" w:w="20"/>
-              <w:left w:type="dxa" w:w="80"/>
-              <w:bottom w:type="dxa" w:w="20"/>
-              <w:right w:type="dxa" w:w="80"/>
-            </w:tcMar>
-            <w:vAlign w:val="center"/>
-          </w:tcPr>
-          <w:p>
-            <w:pPr>
-              <w:spacing w:line="240"/>
-              <w:ind w:firstLine="0"/>
-              <w:jc w:val="left"/>
-            </w:pPr>
-            <w:r>
-              <w:rPr>
-                <w:rFonts w:ascii="Times New Roman" w:cs="Times New Roman" w:eastAsia="Times New Roman" w:hAnsi="Times New Roman"/>
-                <w:sz w:val="22"/>
-                <w:szCs w:val="22"/>
-              </w:rPr>
-              <w:t xml:space="preserve">Предупреждение о негладкой функции и недостигнутой точности</w:t>
+            <w:tcW w:type="dxa" w:w="5522"/>
+            <w:tcBorders>
+              <w:top w:val="single" w:color="000000" w:sz="4"/>
+              <w:left w:val="single" w:color="000000" w:sz="4"/>
+              <w:bottom w:val="single" w:color="000000" w:sz="4"/>
+              <w:right w:val="single" w:color="000000" w:sz="4"/>
+            </w:tcBorders>
+            <w:tcMar>
+              <w:top w:type="dxa" w:w="20"/>
+              <w:left w:type="dxa" w:w="80"/>
+              <w:bottom w:type="dxa" w:w="20"/>
+              <w:right w:type="dxa" w:w="80"/>
+            </w:tcMar>
+            <w:vAlign w:val="center"/>
+          </w:tcPr>
+          <w:p>
+            <w:pPr>
+              <w:spacing w:line="240"/>
+              <w:ind w:firstLine="0"/>
+              <w:jc w:val="left"/>
+            </w:pPr>
+            <w:r>
+              <w:rPr>
+                <w:rFonts w:ascii="Times New Roman" w:cs="Times New Roman" w:eastAsia="Times New Roman" w:hAnsi="Times New Roman"/>
+                <w:sz w:val="22"/>
+                <w:szCs w:val="22"/>
+              </w:rPr>
+              <w:t xml:space="preserve">Предупреждения: нечётное n, недостигнутая точность, негладкая функция</w:t>
             </w:r>
           </w:p>
         </w:tc>
@@ -18530,7 +21407,7 @@
         </w:trPr>
         <w:tc>
           <w:tcPr>
-            <w:tcW w:type="dxa" w:w="2300"/>
+            <w:tcW w:type="dxa" w:w="2500"/>
             <w:tcBorders>
               <w:top w:val="single" w:color="000000" w:sz="4"/>
               <w:left w:val="single" w:color="000000" w:sz="4"/>
@@ -18596,34 +21473,34 @@
         </w:tc>
         <w:tc>
           <w:tcPr>
-            <w:tcW w:type="dxa" w:w="5722"/>
-            <w:tcBorders>
-              <w:top w:val="single" w:color="000000" w:sz="4"/>
-              <w:left w:val="single" w:color="000000" w:sz="4"/>
-              <w:bottom w:val="single" w:color="000000" w:sz="4"/>
-              <w:right w:val="single" w:color="000000" w:sz="4"/>
-            </w:tcBorders>
-            <w:tcMar>
-              <w:top w:type="dxa" w:w="20"/>
-              <w:left w:type="dxa" w:w="80"/>
-              <w:bottom w:type="dxa" w:w="20"/>
-              <w:right w:type="dxa" w:w="80"/>
-            </w:tcMar>
-            <w:vAlign w:val="center"/>
-          </w:tcPr>
-          <w:p>
-            <w:pPr>
-              <w:spacing w:line="240"/>
-              <w:ind w:firstLine="0"/>
-              <w:jc w:val="left"/>
-            </w:pPr>
-            <w:r>
-              <w:rPr>
-                <w:rFonts w:ascii="Times New Roman" w:cs="Times New Roman" w:eastAsia="Times New Roman" w:hAnsi="Times New Roman"/>
-                <w:sz w:val="22"/>
-                <w:szCs w:val="22"/>
-              </w:rPr>
-              <w:t xml:space="preserve">Таблица сходимости: n, значение, оценка погрешности</w:t>
+            <w:tcW w:type="dxa" w:w="5522"/>
+            <w:tcBorders>
+              <w:top w:val="single" w:color="000000" w:sz="4"/>
+              <w:left w:val="single" w:color="000000" w:sz="4"/>
+              <w:bottom w:val="single" w:color="000000" w:sz="4"/>
+              <w:right w:val="single" w:color="000000" w:sz="4"/>
+            </w:tcBorders>
+            <w:tcMar>
+              <w:top w:type="dxa" w:w="20"/>
+              <w:left w:type="dxa" w:w="80"/>
+              <w:bottom w:type="dxa" w:w="20"/>
+              <w:right w:type="dxa" w:w="80"/>
+            </w:tcMar>
+            <w:vAlign w:val="center"/>
+          </w:tcPr>
+          <w:p>
+            <w:pPr>
+              <w:spacing w:line="240"/>
+              <w:ind w:firstLine="0"/>
+              <w:jc w:val="left"/>
+            </w:pPr>
+            <w:r>
+              <w:rPr>
+                <w:rFonts w:ascii="Times New Roman" w:cs="Times New Roman" w:eastAsia="Times New Roman" w:hAnsi="Times New Roman"/>
+                <w:sz w:val="22"/>
+                <w:szCs w:val="22"/>
+              </w:rPr>
+              <w:t xml:space="preserve">Таблица сходимости выбранного метода: n, значение, оценка погрешности</w:t>
             </w:r>
           </w:p>
         </w:tc>
@@ -18641,7 +21518,7 @@
           <w:sz w:val="28"/>
           <w:szCs w:val="28"/>
         </w:rPr>
-        <w:t xml:space="preserve">Макет будет уточнён после создания форм и приведён в приложении «Формы программы» пояснительной записки.</w:t>
+        <w:t xml:space="preserve">Формы реализованы в проекте Integral.App (фаза 3): MainForm, CalcForm, GraphForm, HelpForm, AboutForm. Ошибки ввода сопровождаются сообщением и переходом курсора в ошибочное поле; при ошибке в формуле курсор ставится на позицию ошибки. Подсказки элементов выводятся в строке состояния. Снимки окон будут приведены в приложении «Формы программы» пояснительной записки.</w:t>
       </w:r>
     </w:p>
     <w:p>

</xml_diff>

<commit_message>
KT docx: explicit Normal style so Word/Google Docs keep Times New Roman
Co-Authored-By: Claude Sonnet 5.5 <noreply@anthropic.com>
Claude-Session: https://claude.ai/code/session_01GVqkJddKe6CucL3vgR8vdk
</commit_message>
<xml_diff>
--- a/docs/kt/KT_materialy_2026-10-19.docx
+++ b/docs/kt/KT_materialy_2026-10-19.docx
@@ -27983,6 +27983,7 @@
     </w:pPr>
     <w:r>
       <w:rPr>
+        <w:rFonts w:ascii="Times New Roman" w:cs="Times New Roman" w:eastAsia="Times New Roman" w:hAnsi="Times New Roman"/>
         <w:sz w:val="2"/>
         <w:szCs w:val="2"/>
       </w:rPr>
@@ -29490,6 +29491,7 @@
     </w:pPr>
     <w:r>
       <w:rPr>
+        <w:rFonts w:ascii="Times New Roman" w:cs="Times New Roman" w:eastAsia="Times New Roman" w:hAnsi="Times New Roman"/>
         <w:sz w:val="2"/>
         <w:szCs w:val="2"/>
       </w:rPr>
@@ -29924,5 +29926,14 @@
       <w:szCs w:val="20"/>
     </w:rPr>
   </w:style>
+  <w:style w:type="paragraph" w:styleId="Normal">
+    <w:name w:val="Normal"/>
+    <w:qFormat/>
+    <w:rPr>
+      <w:rFonts w:ascii="Times New Roman" w:cs="Times New Roman" w:eastAsia="Times New Roman" w:hAnsi="Times New Roman"/>
+      <w:sz w:val="28"/>
+      <w:szCs w:val="28"/>
+    </w:rPr>
+  </w:style>
 </w:styles>
 </file>
</xml_diff>

<commit_message>
KT 19.10: installer (NSIS), KT document wording matches the build
- installer/Integral.nsi, tools/make_installer.sh: per-user setup.exe (no admin
  rights), .NET Framework 4.8 check, shortcuts, uninstaller
- KT document: export handler is stage 5; drop internal 'phase' wording

Co-Authored-By: Claude Sonnet 5.5 <noreply@anthropic.com>
Claude-Session: https://claude.ai/code/session_01GVqkJddKe6CucL3vgR8vdk
</commit_message>
<xml_diff>
--- a/docs/kt/KT_materialy_2026-10-19.docx
+++ b/docs/kt/KT_materialy_2026-10-19.docx
@@ -18998,7 +18998,7 @@
                 <w:sz w:val="22"/>
                 <w:szCs w:val="22"/>
               </w:rPr>
-              <w:t xml:space="preserve">Экспорт отчёта в HTML…</w:t>
+              <w:t xml:space="preserve">Экспорт отчёта в HTML… (обработчик — этап 5)</w:t>
             </w:r>
           </w:p>
         </w:tc>
@@ -21518,7 +21518,7 @@
           <w:sz w:val="28"/>
           <w:szCs w:val="28"/>
         </w:rPr>
-        <w:t xml:space="preserve">Формы реализованы в проекте Integral.App (фаза 3): MainForm, CalcForm, GraphForm, HelpForm, AboutForm. Ошибки ввода сопровождаются сообщением и переходом курсора в ошибочное поле; при ошибке в формуле курсор ставится на позицию ошибки. Подсказки элементов выводятся в строке состояния. Снимки окон будут приведены в приложении «Формы программы» пояснительной записки.</w:t>
+        <w:t xml:space="preserve">Формы реализованы в проекте Integral.App (этап 3 календарного плана): MainForm, CalcForm, GraphForm, HelpForm, AboutForm. Команда экспорта отчёта в HTML присутствует в меню и на панели инструментов; её обработчик реализуется на этапе 5. Ошибки ввода сопровождаются сообщением и переходом курсора в ошибочное поле; при ошибке в формуле курсор ставится на позицию ошибки. Подсказки элементов выводятся в строке состояния. Снимки окон будут приведены в приложении «Формы программы» пояснительной записки.</w:t>
       </w:r>
     </w:p>
     <w:p>

</xml_diff>